<commit_message>
added username to reviews section per cra
</commit_message>
<xml_diff>
--- a/Assignment declaration v1-1.docx
+++ b/Assignment declaration v1-1.docx
@@ -133,1071 +133,13 @@
           <w:between w:val="nil"/>
         </w:pBdr>
       </w:pPr>
-    </w:p>
-    <w:p>
-      <w:pPr>
-        <w:pBdr>
-          <w:top w:val="nil"/>
-          <w:left w:val="nil"/>
-          <w:bottom w:val="nil"/>
-          <w:right w:val="nil"/>
-          <w:between w:val="nil"/>
-        </w:pBdr>
-      </w:pPr>
-      <w:r>
-        <w:t xml:space="preserve">Please </w:t>
-      </w:r>
-      <w:r>
-        <w:t xml:space="preserve">declare your team details on </w:t>
-      </w:r>
-      <w:r>
-        <w:t>this</w:t>
-      </w:r>
-      <w:r>
-        <w:t xml:space="preserve"> submission itself by completing and including one of the two table options below</w:t>
-      </w:r>
-      <w:r>
-        <w:t xml:space="preserve">. The details </w:t>
-      </w:r>
-      <w:r>
-        <w:t xml:space="preserve">should reflect the same team as defined </w:t>
-      </w:r>
-      <w:r>
-        <w:t xml:space="preserve">in your </w:t>
-      </w:r>
-      <w:r>
-        <w:t xml:space="preserve">canvas </w:t>
-      </w:r>
-      <w:r>
-        <w:t xml:space="preserve">group. It </w:t>
-      </w:r>
-      <w:r>
-        <w:t xml:space="preserve">will assist </w:t>
-      </w:r>
-      <w:r>
-        <w:t>the marker.</w:t>
-      </w:r>
-    </w:p>
-    <w:p>
-      <w:pPr>
-        <w:pBdr>
-          <w:top w:val="nil"/>
-          <w:left w:val="nil"/>
-          <w:bottom w:val="nil"/>
-          <w:right w:val="nil"/>
-          <w:between w:val="nil"/>
-        </w:pBdr>
-      </w:pPr>
-    </w:p>
-    <w:p>
-      <w:pPr>
-        <w:pBdr>
-          <w:top w:val="nil"/>
-          <w:left w:val="nil"/>
-          <w:bottom w:val="nil"/>
-          <w:right w:val="nil"/>
-          <w:between w:val="nil"/>
-        </w:pBdr>
-        <w:rPr>
-          <w:color w:val="0070C0"/>
-        </w:rPr>
-      </w:pPr>
-      <w:r>
-        <w:rPr>
-          <w:color w:val="0070C0"/>
-        </w:rPr>
-        <w:t xml:space="preserve">Delete </w:t>
-      </w:r>
-      <w:r>
-        <w:rPr>
-          <w:color w:val="0070C0"/>
-        </w:rPr>
-        <w:t>the</w:t>
-      </w:r>
-      <w:r>
-        <w:rPr>
-          <w:color w:val="0070C0"/>
-        </w:rPr>
-        <w:t xml:space="preserve"> blue guide text</w:t>
-      </w:r>
-      <w:r>
-        <w:rPr>
-          <w:color w:val="0070C0"/>
-        </w:rPr>
-        <w:t xml:space="preserve"> through the document</w:t>
-      </w:r>
-      <w:r>
-        <w:rPr>
-          <w:color w:val="0070C0"/>
-        </w:rPr>
-        <w:t>.</w:t>
-      </w:r>
-    </w:p>
-    <w:p>
-      <w:pPr>
-        <w:pBdr>
-          <w:top w:val="nil"/>
-          <w:left w:val="nil"/>
-          <w:bottom w:val="nil"/>
-          <w:right w:val="nil"/>
-          <w:between w:val="nil"/>
-        </w:pBdr>
-        <w:rPr>
-          <w:color w:val="0070C0"/>
-        </w:rPr>
-      </w:pPr>
-    </w:p>
-    <w:p>
-      <w:pPr>
-        <w:pBdr>
-          <w:top w:val="nil"/>
-          <w:left w:val="nil"/>
-          <w:bottom w:val="nil"/>
-          <w:right w:val="nil"/>
-          <w:between w:val="nil"/>
-        </w:pBdr>
-        <w:rPr>
-          <w:color w:val="0070C0"/>
-        </w:rPr>
-      </w:pPr>
-      <w:r>
-        <w:rPr>
-          <w:color w:val="0070C0"/>
-        </w:rPr>
-        <w:t>Use either Option A or Option B and delete the one not used.</w:t>
-      </w:r>
-    </w:p>
-    <w:p>
-      <w:pPr>
-        <w:pBdr>
-          <w:top w:val="nil"/>
-          <w:left w:val="nil"/>
-          <w:bottom w:val="nil"/>
-          <w:right w:val="nil"/>
-          <w:between w:val="nil"/>
-        </w:pBdr>
-      </w:pPr>
-    </w:p>
-    <w:p>
-      <w:pPr>
-        <w:pBdr>
-          <w:top w:val="nil"/>
-          <w:left w:val="nil"/>
-          <w:bottom w:val="nil"/>
-          <w:right w:val="nil"/>
-          <w:between w:val="nil"/>
-        </w:pBdr>
-      </w:pPr>
-      <w:r>
-        <w:rPr>
-          <w:b/>
-          <w:bCs/>
-        </w:rPr>
-        <w:t>Option A</w:t>
-      </w:r>
-      <w:r>
-        <w:rPr>
-          <w:b/>
-          <w:bCs/>
-        </w:rPr>
-        <w:t>:</w:t>
-      </w:r>
-      <w:r>
-        <w:rPr>
-          <w:color w:val="0070C0"/>
-        </w:rPr>
-        <w:t xml:space="preserve"> – </w:t>
-      </w:r>
-      <w:r>
-        <w:rPr>
-          <w:color w:val="0070C0"/>
-        </w:rPr>
-        <w:t>Most will use this option. D</w:t>
-      </w:r>
-      <w:r>
-        <w:rPr>
-          <w:color w:val="0070C0"/>
-        </w:rPr>
-        <w:t>elete if not used</w:t>
-      </w:r>
-    </w:p>
-    <w:tbl>
-      <w:tblPr>
-        <w:tblW w:w="9015" w:type="dxa"/>
-        <w:tblBorders>
-          <w:top w:val="single" w:sz="8" w:space="0" w:color="003366"/>
-          <w:left w:val="single" w:sz="8" w:space="0" w:color="003366"/>
-          <w:bottom w:val="single" w:sz="8" w:space="0" w:color="003366"/>
-          <w:right w:val="single" w:sz="8" w:space="0" w:color="003366"/>
-          <w:insideH w:val="single" w:sz="8" w:space="0" w:color="003366"/>
-          <w:insideV w:val="single" w:sz="8" w:space="0" w:color="003366"/>
-        </w:tblBorders>
-        <w:tblLayout w:type="fixed"/>
-        <w:tblLook w:val="0600" w:firstRow="0" w:lastRow="0" w:firstColumn="0" w:lastColumn="0" w:noHBand="1" w:noVBand="1"/>
-      </w:tblPr>
-      <w:tblGrid>
-        <w:gridCol w:w="3090"/>
-        <w:gridCol w:w="1350"/>
-        <w:gridCol w:w="4575"/>
-      </w:tblGrid>
-      <w:tr>
-        <w:trPr>
-          <w:trHeight w:val="420"/>
-        </w:trPr>
-        <w:tc>
-          <w:tcPr>
-            <w:tcW w:w="9015" w:type="dxa"/>
-            <w:gridSpan w:val="3"/>
-            <w:shd w:val="clear" w:color="auto" w:fill="275317" w:themeFill="accent6" w:themeFillShade="80"/>
-            <w:tcMar>
-              <w:top w:w="100" w:type="dxa"/>
-              <w:left w:w="100" w:type="dxa"/>
-              <w:bottom w:w="100" w:type="dxa"/>
-              <w:right w:w="100" w:type="dxa"/>
-            </w:tcMar>
-          </w:tcPr>
-          <w:p>
-            <w:pPr>
-              <w:widowControl w:val="0"/>
-              <w:pBdr>
-                <w:top w:val="nil"/>
-                <w:left w:val="nil"/>
-                <w:bottom w:val="nil"/>
-                <w:right w:val="nil"/>
-                <w:between w:val="nil"/>
-              </w:pBdr>
-              <w:jc w:val="center"/>
-              <w:rPr>
-                <w:b/>
-                <w:color w:val="FFFFFF"/>
-              </w:rPr>
-            </w:pPr>
-            <w:r>
-              <w:rPr>
-                <w:b/>
-                <w:color w:val="FFFFFF"/>
-              </w:rPr>
-              <w:t>Functional Team – most teams should use this one</w:t>
-            </w:r>
-          </w:p>
-        </w:tc>
-      </w:tr>
-      <w:tr>
-        <w:trPr>
-          <w:trHeight w:val="420"/>
-        </w:trPr>
-        <w:tc>
-          <w:tcPr>
-            <w:tcW w:w="3090" w:type="dxa"/>
-            <w:shd w:val="clear" w:color="auto" w:fill="275317" w:themeFill="accent6" w:themeFillShade="80"/>
-            <w:tcMar>
-              <w:top w:w="100" w:type="dxa"/>
-              <w:left w:w="100" w:type="dxa"/>
-              <w:bottom w:w="100" w:type="dxa"/>
-              <w:right w:w="100" w:type="dxa"/>
-            </w:tcMar>
-          </w:tcPr>
-          <w:p>
-            <w:pPr>
-              <w:widowControl w:val="0"/>
-              <w:pBdr>
-                <w:top w:val="nil"/>
-                <w:left w:val="nil"/>
-                <w:bottom w:val="nil"/>
-                <w:right w:val="nil"/>
-                <w:between w:val="nil"/>
-              </w:pBdr>
-              <w:jc w:val="center"/>
-              <w:rPr>
-                <w:color w:val="FFFFFF"/>
-              </w:rPr>
-            </w:pPr>
-            <w:r>
-              <w:rPr>
-                <w:color w:val="FFFFFF"/>
-              </w:rPr>
-              <w:t>Canvas team identifier:</w:t>
-            </w:r>
-          </w:p>
-        </w:tc>
-        <w:tc>
-          <w:tcPr>
-            <w:tcW w:w="5925" w:type="dxa"/>
-            <w:gridSpan w:val="2"/>
-            <w:tcMar>
-              <w:top w:w="100" w:type="dxa"/>
-              <w:left w:w="100" w:type="dxa"/>
-              <w:bottom w:w="100" w:type="dxa"/>
-              <w:right w:w="100" w:type="dxa"/>
-            </w:tcMar>
-          </w:tcPr>
-          <w:p>
-            <w:pPr>
-              <w:widowControl w:val="0"/>
-              <w:pBdr>
-                <w:top w:val="nil"/>
-                <w:left w:val="nil"/>
-                <w:bottom w:val="nil"/>
-                <w:right w:val="nil"/>
-                <w:between w:val="nil"/>
-              </w:pBdr>
-            </w:pPr>
-          </w:p>
-        </w:tc>
-      </w:tr>
-      <w:tr>
-        <w:trPr>
-          <w:trHeight w:val="420"/>
-        </w:trPr>
-        <w:tc>
-          <w:tcPr>
-            <w:tcW w:w="3090" w:type="dxa"/>
-            <w:shd w:val="clear" w:color="auto" w:fill="275317" w:themeFill="accent6" w:themeFillShade="80"/>
-            <w:tcMar>
-              <w:top w:w="100" w:type="dxa"/>
-              <w:left w:w="100" w:type="dxa"/>
-              <w:bottom w:w="100" w:type="dxa"/>
-              <w:right w:w="100" w:type="dxa"/>
-            </w:tcMar>
-          </w:tcPr>
-          <w:p>
-            <w:pPr>
-              <w:widowControl w:val="0"/>
-              <w:pBdr>
-                <w:top w:val="nil"/>
-                <w:left w:val="nil"/>
-                <w:bottom w:val="nil"/>
-                <w:right w:val="nil"/>
-                <w:between w:val="nil"/>
-              </w:pBdr>
-              <w:jc w:val="center"/>
-              <w:rPr>
-                <w:color w:val="FFFFFF"/>
-              </w:rPr>
-            </w:pPr>
-            <w:r>
-              <w:rPr>
-                <w:color w:val="FFFFFF"/>
-              </w:rPr>
-              <w:t>Tutor:</w:t>
-            </w:r>
-          </w:p>
-        </w:tc>
-        <w:tc>
-          <w:tcPr>
-            <w:tcW w:w="5925" w:type="dxa"/>
-            <w:gridSpan w:val="2"/>
-            <w:tcMar>
-              <w:top w:w="100" w:type="dxa"/>
-              <w:left w:w="100" w:type="dxa"/>
-              <w:bottom w:w="100" w:type="dxa"/>
-              <w:right w:w="100" w:type="dxa"/>
-            </w:tcMar>
-          </w:tcPr>
-          <w:p>
-            <w:pPr>
-              <w:widowControl w:val="0"/>
-              <w:pBdr>
-                <w:top w:val="nil"/>
-                <w:left w:val="nil"/>
-                <w:bottom w:val="nil"/>
-                <w:right w:val="nil"/>
-                <w:between w:val="nil"/>
-              </w:pBdr>
-            </w:pPr>
-          </w:p>
-        </w:tc>
-      </w:tr>
-      <w:tr>
-        <w:trPr>
-          <w:trHeight w:val="420"/>
-        </w:trPr>
-        <w:tc>
-          <w:tcPr>
-            <w:tcW w:w="3090" w:type="dxa"/>
-            <w:shd w:val="clear" w:color="auto" w:fill="275317" w:themeFill="accent6" w:themeFillShade="80"/>
-            <w:tcMar>
-              <w:top w:w="100" w:type="dxa"/>
-              <w:left w:w="100" w:type="dxa"/>
-              <w:bottom w:w="100" w:type="dxa"/>
-              <w:right w:w="100" w:type="dxa"/>
-            </w:tcMar>
-          </w:tcPr>
-          <w:p>
-            <w:pPr>
-              <w:widowControl w:val="0"/>
-              <w:pBdr>
-                <w:top w:val="nil"/>
-                <w:left w:val="nil"/>
-                <w:bottom w:val="nil"/>
-                <w:right w:val="nil"/>
-                <w:between w:val="nil"/>
-              </w:pBdr>
-              <w:jc w:val="center"/>
-              <w:rPr>
-                <w:color w:val="FFFFFF"/>
-              </w:rPr>
-            </w:pPr>
-            <w:r>
-              <w:rPr>
-                <w:color w:val="FFFFFF"/>
-              </w:rPr>
-              <w:t>Day and time of tutorial:</w:t>
-            </w:r>
-          </w:p>
-        </w:tc>
-        <w:tc>
-          <w:tcPr>
-            <w:tcW w:w="5925" w:type="dxa"/>
-            <w:gridSpan w:val="2"/>
-            <w:tcMar>
-              <w:top w:w="100" w:type="dxa"/>
-              <w:left w:w="100" w:type="dxa"/>
-              <w:bottom w:w="100" w:type="dxa"/>
-              <w:right w:w="100" w:type="dxa"/>
-            </w:tcMar>
-          </w:tcPr>
-          <w:p>
-            <w:pPr>
-              <w:widowControl w:val="0"/>
-              <w:pBdr>
-                <w:top w:val="nil"/>
-                <w:left w:val="nil"/>
-                <w:bottom w:val="nil"/>
-                <w:right w:val="nil"/>
-                <w:between w:val="nil"/>
-              </w:pBdr>
-            </w:pPr>
-          </w:p>
-        </w:tc>
-      </w:tr>
-      <w:tr>
-        <w:trPr>
-          <w:trHeight w:val="420"/>
-        </w:trPr>
-        <w:tc>
-          <w:tcPr>
-            <w:tcW w:w="3090" w:type="dxa"/>
-            <w:tcBorders>
-              <w:bottom w:val="single" w:sz="8" w:space="0" w:color="auto"/>
-            </w:tcBorders>
-            <w:shd w:val="clear" w:color="auto" w:fill="275317" w:themeFill="accent6" w:themeFillShade="80"/>
-            <w:tcMar>
-              <w:top w:w="100" w:type="dxa"/>
-              <w:left w:w="100" w:type="dxa"/>
-              <w:bottom w:w="100" w:type="dxa"/>
-              <w:right w:w="100" w:type="dxa"/>
-            </w:tcMar>
-          </w:tcPr>
-          <w:p>
-            <w:pPr>
-              <w:widowControl w:val="0"/>
-              <w:pBdr>
-                <w:top w:val="nil"/>
-                <w:left w:val="nil"/>
-                <w:bottom w:val="nil"/>
-                <w:right w:val="nil"/>
-                <w:between w:val="nil"/>
-              </w:pBdr>
-              <w:jc w:val="center"/>
-              <w:rPr>
-                <w:color w:val="FFFFFF"/>
-              </w:rPr>
-            </w:pPr>
-            <w:r>
-              <w:rPr>
-                <w:color w:val="FFFFFF"/>
-              </w:rPr>
-              <w:t>GitHub</w:t>
-            </w:r>
-            <w:r>
-              <w:rPr>
-                <w:color w:val="FFFFFF"/>
-              </w:rPr>
-              <w:t xml:space="preserve"> name and link:</w:t>
-            </w:r>
-          </w:p>
-        </w:tc>
-        <w:tc>
-          <w:tcPr>
-            <w:tcW w:w="5925" w:type="dxa"/>
-            <w:gridSpan w:val="2"/>
-            <w:tcBorders>
-              <w:bottom w:val="single" w:sz="8" w:space="0" w:color="auto"/>
-            </w:tcBorders>
-            <w:tcMar>
-              <w:top w:w="100" w:type="dxa"/>
-              <w:left w:w="100" w:type="dxa"/>
-              <w:bottom w:w="100" w:type="dxa"/>
-              <w:right w:w="100" w:type="dxa"/>
-            </w:tcMar>
-          </w:tcPr>
-          <w:p>
-            <w:pPr>
-              <w:widowControl w:val="0"/>
-              <w:pBdr>
-                <w:top w:val="nil"/>
-                <w:left w:val="nil"/>
-                <w:bottom w:val="nil"/>
-                <w:right w:val="nil"/>
-                <w:between w:val="nil"/>
-              </w:pBdr>
-            </w:pPr>
-          </w:p>
-        </w:tc>
-      </w:tr>
-      <w:tr>
-        <w:tc>
-          <w:tcPr>
-            <w:tcW w:w="3090" w:type="dxa"/>
-            <w:tcBorders>
-              <w:top w:val="single" w:sz="8" w:space="0" w:color="auto"/>
-              <w:left w:val="single" w:sz="8" w:space="0" w:color="auto"/>
-              <w:bottom w:val="single" w:sz="8" w:space="0" w:color="auto"/>
-              <w:right w:val="single" w:sz="8" w:space="0" w:color="auto"/>
-            </w:tcBorders>
-            <w:shd w:val="clear" w:color="auto" w:fill="275317" w:themeFill="accent6" w:themeFillShade="80"/>
-            <w:tcMar>
-              <w:top w:w="100" w:type="dxa"/>
-              <w:left w:w="100" w:type="dxa"/>
-              <w:bottom w:w="100" w:type="dxa"/>
-              <w:right w:w="100" w:type="dxa"/>
-            </w:tcMar>
-          </w:tcPr>
-          <w:p>
-            <w:pPr>
-              <w:widowControl w:val="0"/>
-              <w:pBdr>
-                <w:top w:val="nil"/>
-                <w:left w:val="nil"/>
-                <w:bottom w:val="nil"/>
-                <w:right w:val="nil"/>
-                <w:between w:val="nil"/>
-              </w:pBdr>
-              <w:jc w:val="center"/>
-              <w:rPr>
-                <w:color w:val="FFFFFF"/>
-              </w:rPr>
-            </w:pPr>
-            <w:r>
-              <w:rPr>
-                <w:color w:val="FFFFFF"/>
-              </w:rPr>
-              <w:t>Full name</w:t>
-            </w:r>
-          </w:p>
-        </w:tc>
-        <w:tc>
-          <w:tcPr>
-            <w:tcW w:w="1350" w:type="dxa"/>
-            <w:tcBorders>
-              <w:top w:val="single" w:sz="8" w:space="0" w:color="auto"/>
-              <w:left w:val="single" w:sz="8" w:space="0" w:color="auto"/>
-              <w:bottom w:val="single" w:sz="8" w:space="0" w:color="auto"/>
-              <w:right w:val="single" w:sz="8" w:space="0" w:color="auto"/>
-            </w:tcBorders>
-            <w:shd w:val="clear" w:color="auto" w:fill="275317" w:themeFill="accent6" w:themeFillShade="80"/>
-            <w:tcMar>
-              <w:top w:w="100" w:type="dxa"/>
-              <w:left w:w="100" w:type="dxa"/>
-              <w:bottom w:w="100" w:type="dxa"/>
-              <w:right w:w="100" w:type="dxa"/>
-            </w:tcMar>
-          </w:tcPr>
-          <w:p>
-            <w:pPr>
-              <w:widowControl w:val="0"/>
-              <w:pBdr>
-                <w:top w:val="nil"/>
-                <w:left w:val="nil"/>
-                <w:bottom w:val="nil"/>
-                <w:right w:val="nil"/>
-                <w:between w:val="nil"/>
-              </w:pBdr>
-              <w:jc w:val="center"/>
-              <w:rPr>
-                <w:color w:val="FFFFFF"/>
-              </w:rPr>
-            </w:pPr>
-            <w:r>
-              <w:rPr>
-                <w:color w:val="FFFFFF"/>
-              </w:rPr>
-              <w:t>Student#</w:t>
-            </w:r>
-          </w:p>
-        </w:tc>
-        <w:tc>
-          <w:tcPr>
-            <w:tcW w:w="4575" w:type="dxa"/>
-            <w:tcBorders>
-              <w:top w:val="single" w:sz="8" w:space="0" w:color="auto"/>
-              <w:left w:val="single" w:sz="8" w:space="0" w:color="auto"/>
-              <w:bottom w:val="single" w:sz="8" w:space="0" w:color="auto"/>
-              <w:right w:val="single" w:sz="8" w:space="0" w:color="auto"/>
-            </w:tcBorders>
-            <w:shd w:val="clear" w:color="auto" w:fill="275317" w:themeFill="accent6" w:themeFillShade="80"/>
-            <w:tcMar>
-              <w:top w:w="100" w:type="dxa"/>
-              <w:left w:w="100" w:type="dxa"/>
-              <w:bottom w:w="100" w:type="dxa"/>
-              <w:right w:w="100" w:type="dxa"/>
-            </w:tcMar>
-          </w:tcPr>
-          <w:p>
-            <w:pPr>
-              <w:widowControl w:val="0"/>
-              <w:pBdr>
-                <w:top w:val="nil"/>
-                <w:left w:val="nil"/>
-                <w:bottom w:val="nil"/>
-                <w:right w:val="nil"/>
-                <w:between w:val="nil"/>
-              </w:pBdr>
-              <w:jc w:val="center"/>
-              <w:rPr>
-                <w:color w:val="FFFFFF"/>
-              </w:rPr>
-            </w:pPr>
-            <w:r>
-              <w:rPr>
-                <w:color w:val="FFFFFF"/>
-              </w:rPr>
-              <w:t>QUT Email</w:t>
-            </w:r>
-          </w:p>
-        </w:tc>
-      </w:tr>
-      <w:tr>
-        <w:tc>
-          <w:tcPr>
-            <w:tcW w:w="3090" w:type="dxa"/>
-            <w:tcBorders>
-              <w:top w:val="single" w:sz="8" w:space="0" w:color="auto"/>
-            </w:tcBorders>
-            <w:tcMar>
-              <w:top w:w="100" w:type="dxa"/>
-              <w:left w:w="100" w:type="dxa"/>
-              <w:bottom w:w="100" w:type="dxa"/>
-              <w:right w:w="100" w:type="dxa"/>
-            </w:tcMar>
-          </w:tcPr>
-          <w:p>
-            <w:pPr>
-              <w:widowControl w:val="0"/>
-              <w:pBdr>
-                <w:top w:val="nil"/>
-                <w:left w:val="nil"/>
-                <w:bottom w:val="nil"/>
-                <w:right w:val="nil"/>
-                <w:between w:val="nil"/>
-              </w:pBdr>
-            </w:pPr>
-          </w:p>
-        </w:tc>
-        <w:tc>
-          <w:tcPr>
-            <w:tcW w:w="1350" w:type="dxa"/>
-            <w:tcBorders>
-              <w:top w:val="single" w:sz="8" w:space="0" w:color="auto"/>
-            </w:tcBorders>
-            <w:tcMar>
-              <w:top w:w="100" w:type="dxa"/>
-              <w:left w:w="100" w:type="dxa"/>
-              <w:bottom w:w="100" w:type="dxa"/>
-              <w:right w:w="100" w:type="dxa"/>
-            </w:tcMar>
-          </w:tcPr>
-          <w:p>
-            <w:pPr>
-              <w:widowControl w:val="0"/>
-              <w:pBdr>
-                <w:top w:val="nil"/>
-                <w:left w:val="nil"/>
-                <w:bottom w:val="nil"/>
-                <w:right w:val="nil"/>
-                <w:between w:val="nil"/>
-              </w:pBdr>
-            </w:pPr>
-          </w:p>
-        </w:tc>
-        <w:tc>
-          <w:tcPr>
-            <w:tcW w:w="4575" w:type="dxa"/>
-            <w:tcBorders>
-              <w:top w:val="single" w:sz="8" w:space="0" w:color="auto"/>
-            </w:tcBorders>
-            <w:tcMar>
-              <w:top w:w="100" w:type="dxa"/>
-              <w:left w:w="100" w:type="dxa"/>
-              <w:bottom w:w="100" w:type="dxa"/>
-              <w:right w:w="100" w:type="dxa"/>
-            </w:tcMar>
-          </w:tcPr>
-          <w:p>
-            <w:pPr>
-              <w:widowControl w:val="0"/>
-              <w:pBdr>
-                <w:top w:val="nil"/>
-                <w:left w:val="nil"/>
-                <w:bottom w:val="nil"/>
-                <w:right w:val="nil"/>
-                <w:between w:val="nil"/>
-              </w:pBdr>
-            </w:pPr>
-          </w:p>
-        </w:tc>
-      </w:tr>
-      <w:tr>
-        <w:tc>
-          <w:tcPr>
-            <w:tcW w:w="3090" w:type="dxa"/>
-            <w:tcMar>
-              <w:top w:w="100" w:type="dxa"/>
-              <w:left w:w="100" w:type="dxa"/>
-              <w:bottom w:w="100" w:type="dxa"/>
-              <w:right w:w="100" w:type="dxa"/>
-            </w:tcMar>
-          </w:tcPr>
-          <w:p>
-            <w:pPr>
-              <w:widowControl w:val="0"/>
-              <w:pBdr>
-                <w:top w:val="nil"/>
-                <w:left w:val="nil"/>
-                <w:bottom w:val="nil"/>
-                <w:right w:val="nil"/>
-                <w:between w:val="nil"/>
-              </w:pBdr>
-            </w:pPr>
-          </w:p>
-        </w:tc>
-        <w:tc>
-          <w:tcPr>
-            <w:tcW w:w="1350" w:type="dxa"/>
-            <w:tcMar>
-              <w:top w:w="100" w:type="dxa"/>
-              <w:left w:w="100" w:type="dxa"/>
-              <w:bottom w:w="100" w:type="dxa"/>
-              <w:right w:w="100" w:type="dxa"/>
-            </w:tcMar>
-          </w:tcPr>
-          <w:p>
-            <w:pPr>
-              <w:widowControl w:val="0"/>
-              <w:pBdr>
-                <w:top w:val="nil"/>
-                <w:left w:val="nil"/>
-                <w:bottom w:val="nil"/>
-                <w:right w:val="nil"/>
-                <w:between w:val="nil"/>
-              </w:pBdr>
-            </w:pPr>
-          </w:p>
-        </w:tc>
-        <w:tc>
-          <w:tcPr>
-            <w:tcW w:w="4575" w:type="dxa"/>
-            <w:tcMar>
-              <w:top w:w="100" w:type="dxa"/>
-              <w:left w:w="100" w:type="dxa"/>
-              <w:bottom w:w="100" w:type="dxa"/>
-              <w:right w:w="100" w:type="dxa"/>
-            </w:tcMar>
-          </w:tcPr>
-          <w:p>
-            <w:pPr>
-              <w:widowControl w:val="0"/>
-              <w:pBdr>
-                <w:top w:val="nil"/>
-                <w:left w:val="nil"/>
-                <w:bottom w:val="nil"/>
-                <w:right w:val="nil"/>
-                <w:between w:val="nil"/>
-              </w:pBdr>
-            </w:pPr>
-          </w:p>
-        </w:tc>
-      </w:tr>
-      <w:tr>
-        <w:tc>
-          <w:tcPr>
-            <w:tcW w:w="3090" w:type="dxa"/>
-            <w:tcMar>
-              <w:top w:w="100" w:type="dxa"/>
-              <w:left w:w="100" w:type="dxa"/>
-              <w:bottom w:w="100" w:type="dxa"/>
-              <w:right w:w="100" w:type="dxa"/>
-            </w:tcMar>
-          </w:tcPr>
-          <w:p>
-            <w:pPr>
-              <w:widowControl w:val="0"/>
-              <w:pBdr>
-                <w:top w:val="nil"/>
-                <w:left w:val="nil"/>
-                <w:bottom w:val="nil"/>
-                <w:right w:val="nil"/>
-                <w:between w:val="nil"/>
-              </w:pBdr>
-            </w:pPr>
-          </w:p>
-        </w:tc>
-        <w:tc>
-          <w:tcPr>
-            <w:tcW w:w="1350" w:type="dxa"/>
-            <w:tcMar>
-              <w:top w:w="100" w:type="dxa"/>
-              <w:left w:w="100" w:type="dxa"/>
-              <w:bottom w:w="100" w:type="dxa"/>
-              <w:right w:w="100" w:type="dxa"/>
-            </w:tcMar>
-          </w:tcPr>
-          <w:p>
-            <w:pPr>
-              <w:widowControl w:val="0"/>
-              <w:pBdr>
-                <w:top w:val="nil"/>
-                <w:left w:val="nil"/>
-                <w:bottom w:val="nil"/>
-                <w:right w:val="nil"/>
-                <w:between w:val="nil"/>
-              </w:pBdr>
-            </w:pPr>
-          </w:p>
-        </w:tc>
-        <w:tc>
-          <w:tcPr>
-            <w:tcW w:w="4575" w:type="dxa"/>
-            <w:tcMar>
-              <w:top w:w="100" w:type="dxa"/>
-              <w:left w:w="100" w:type="dxa"/>
-              <w:bottom w:w="100" w:type="dxa"/>
-              <w:right w:w="100" w:type="dxa"/>
-            </w:tcMar>
-          </w:tcPr>
-          <w:p>
-            <w:pPr>
-              <w:widowControl w:val="0"/>
-              <w:pBdr>
-                <w:top w:val="nil"/>
-                <w:left w:val="nil"/>
-                <w:bottom w:val="nil"/>
-                <w:right w:val="nil"/>
-                <w:between w:val="nil"/>
-              </w:pBdr>
-            </w:pPr>
-          </w:p>
-        </w:tc>
-      </w:tr>
-      <w:tr>
-        <w:tc>
-          <w:tcPr>
-            <w:tcW w:w="3090" w:type="dxa"/>
-            <w:tcMar>
-              <w:top w:w="100" w:type="dxa"/>
-              <w:left w:w="100" w:type="dxa"/>
-              <w:bottom w:w="100" w:type="dxa"/>
-              <w:right w:w="100" w:type="dxa"/>
-            </w:tcMar>
-          </w:tcPr>
-          <w:p>
-            <w:pPr>
-              <w:widowControl w:val="0"/>
-              <w:pBdr>
-                <w:top w:val="nil"/>
-                <w:left w:val="nil"/>
-                <w:bottom w:val="nil"/>
-                <w:right w:val="nil"/>
-                <w:between w:val="nil"/>
-              </w:pBdr>
-            </w:pPr>
-          </w:p>
-        </w:tc>
-        <w:tc>
-          <w:tcPr>
-            <w:tcW w:w="1350" w:type="dxa"/>
-            <w:tcMar>
-              <w:top w:w="100" w:type="dxa"/>
-              <w:left w:w="100" w:type="dxa"/>
-              <w:bottom w:w="100" w:type="dxa"/>
-              <w:right w:w="100" w:type="dxa"/>
-            </w:tcMar>
-          </w:tcPr>
-          <w:p>
-            <w:pPr>
-              <w:widowControl w:val="0"/>
-              <w:pBdr>
-                <w:top w:val="nil"/>
-                <w:left w:val="nil"/>
-                <w:bottom w:val="nil"/>
-                <w:right w:val="nil"/>
-                <w:between w:val="nil"/>
-              </w:pBdr>
-            </w:pPr>
-          </w:p>
-        </w:tc>
-        <w:tc>
-          <w:tcPr>
-            <w:tcW w:w="4575" w:type="dxa"/>
-            <w:tcMar>
-              <w:top w:w="100" w:type="dxa"/>
-              <w:left w:w="100" w:type="dxa"/>
-              <w:bottom w:w="100" w:type="dxa"/>
-              <w:right w:w="100" w:type="dxa"/>
-            </w:tcMar>
-          </w:tcPr>
-          <w:p>
-            <w:pPr>
-              <w:widowControl w:val="0"/>
-              <w:pBdr>
-                <w:top w:val="nil"/>
-                <w:left w:val="nil"/>
-                <w:bottom w:val="nil"/>
-                <w:right w:val="nil"/>
-                <w:between w:val="nil"/>
-              </w:pBdr>
-            </w:pPr>
-          </w:p>
-        </w:tc>
-      </w:tr>
-      <w:tr>
-        <w:tc>
-          <w:tcPr>
-            <w:tcW w:w="3090" w:type="dxa"/>
-            <w:tcMar>
-              <w:top w:w="100" w:type="dxa"/>
-              <w:left w:w="100" w:type="dxa"/>
-              <w:bottom w:w="100" w:type="dxa"/>
-              <w:right w:w="100" w:type="dxa"/>
-            </w:tcMar>
-          </w:tcPr>
-          <w:p>
-            <w:pPr>
-              <w:widowControl w:val="0"/>
-              <w:pBdr>
-                <w:top w:val="nil"/>
-                <w:left w:val="nil"/>
-                <w:bottom w:val="nil"/>
-                <w:right w:val="nil"/>
-                <w:between w:val="nil"/>
-              </w:pBdr>
-            </w:pPr>
-          </w:p>
-        </w:tc>
-        <w:tc>
-          <w:tcPr>
-            <w:tcW w:w="1350" w:type="dxa"/>
-            <w:tcMar>
-              <w:top w:w="100" w:type="dxa"/>
-              <w:left w:w="100" w:type="dxa"/>
-              <w:bottom w:w="100" w:type="dxa"/>
-              <w:right w:w="100" w:type="dxa"/>
-            </w:tcMar>
-          </w:tcPr>
-          <w:p>
-            <w:pPr>
-              <w:widowControl w:val="0"/>
-              <w:pBdr>
-                <w:top w:val="nil"/>
-                <w:left w:val="nil"/>
-                <w:bottom w:val="nil"/>
-                <w:right w:val="nil"/>
-                <w:between w:val="nil"/>
-              </w:pBdr>
-            </w:pPr>
-          </w:p>
-        </w:tc>
-        <w:tc>
-          <w:tcPr>
-            <w:tcW w:w="4575" w:type="dxa"/>
-            <w:tcMar>
-              <w:top w:w="100" w:type="dxa"/>
-              <w:left w:w="100" w:type="dxa"/>
-              <w:bottom w:w="100" w:type="dxa"/>
-              <w:right w:w="100" w:type="dxa"/>
-            </w:tcMar>
-          </w:tcPr>
-          <w:p>
-            <w:pPr>
-              <w:widowControl w:val="0"/>
-              <w:pBdr>
-                <w:top w:val="nil"/>
-                <w:left w:val="nil"/>
-                <w:bottom w:val="nil"/>
-                <w:right w:val="nil"/>
-                <w:between w:val="nil"/>
-              </w:pBdr>
-            </w:pPr>
-          </w:p>
-        </w:tc>
-      </w:tr>
-    </w:tbl>
-    <w:p>
-      <w:pPr>
-        <w:pBdr>
-          <w:top w:val="nil"/>
-          <w:left w:val="nil"/>
-          <w:bottom w:val="nil"/>
-          <w:right w:val="nil"/>
-          <w:between w:val="nil"/>
-        </w:pBdr>
-      </w:pPr>
-    </w:p>
-    <w:p>
-      <w:pPr>
-        <w:pBdr>
-          <w:top w:val="nil"/>
-          <w:left w:val="nil"/>
-          <w:bottom w:val="nil"/>
-          <w:right w:val="nil"/>
-          <w:between w:val="nil"/>
-        </w:pBdr>
+      <w:r>
         <w:rPr>
           <w:rFonts w:ascii="Segoe UI" w:hAnsi="Segoe UI" w:cs="Segoe UI"/>
           <w:b/>
           <w:bCs/>
           <w:color w:val="404040"/>
         </w:rPr>
-      </w:pPr>
-    </w:p>
-    <w:p>
-      <w:pPr>
-        <w:rPr>
-          <w:rFonts w:ascii="Segoe UI" w:hAnsi="Segoe UI" w:cs="Segoe UI"/>
-          <w:b/>
-          <w:bCs/>
-          <w:color w:val="404040"/>
-        </w:rPr>
-      </w:pPr>
-      <w:r>
-        <w:rPr>
-          <w:rFonts w:ascii="Segoe UI" w:hAnsi="Segoe UI" w:cs="Segoe UI"/>
-          <w:b/>
-          <w:bCs/>
-          <w:color w:val="404040"/>
-        </w:rPr>
-        <w:br w:type="page"/>
-      </w:r>
-    </w:p>
-    <w:p>
-      <w:pPr>
-        <w:pBdr>
-          <w:top w:val="nil"/>
-          <w:left w:val="nil"/>
-          <w:bottom w:val="nil"/>
-          <w:right w:val="nil"/>
-          <w:between w:val="nil"/>
-        </w:pBdr>
-      </w:pPr>
-      <w:r>
-        <w:rPr>
-          <w:rFonts w:ascii="Segoe UI" w:hAnsi="Segoe UI" w:cs="Segoe UI"/>
-          <w:b/>
-          <w:bCs/>
-          <w:color w:val="404040"/>
-        </w:rPr>
-        <w:lastRenderedPageBreak/>
         <w:t>Option B</w:t>
       </w:r>
       <w:r>
@@ -1292,8 +234,8 @@
         <w:tblLook w:val="0600" w:firstRow="0" w:lastRow="0" w:firstColumn="0" w:lastColumn="0" w:noHBand="1" w:noVBand="1"/>
       </w:tblPr>
       <w:tblGrid>
-        <w:gridCol w:w="3105"/>
-        <w:gridCol w:w="1155"/>
+        <w:gridCol w:w="2967"/>
+        <w:gridCol w:w="1293"/>
         <w:gridCol w:w="3600"/>
         <w:gridCol w:w="1140"/>
       </w:tblGrid>
@@ -1352,7 +294,7 @@
         </w:trPr>
         <w:tc>
           <w:tcPr>
-            <w:tcW w:w="3105" w:type="dxa"/>
+            <w:tcW w:w="2967" w:type="dxa"/>
             <w:shd w:val="clear" w:color="auto" w:fill="660000"/>
             <w:tcMar>
               <w:top w:w="100" w:type="dxa"/>
@@ -1386,7 +328,7 @@
         </w:tc>
         <w:tc>
           <w:tcPr>
-            <w:tcW w:w="5895" w:type="dxa"/>
+            <w:tcW w:w="6033" w:type="dxa"/>
             <w:gridSpan w:val="3"/>
             <w:tcMar>
               <w:top w:w="100" w:type="dxa"/>
@@ -1406,6 +348,9 @@
                 <w:between w:val="nil"/>
               </w:pBdr>
             </w:pPr>
+            <w:r>
+              <w:t>Group 45</w:t>
+            </w:r>
           </w:p>
         </w:tc>
       </w:tr>
@@ -1415,7 +360,7 @@
         </w:trPr>
         <w:tc>
           <w:tcPr>
-            <w:tcW w:w="3105" w:type="dxa"/>
+            <w:tcW w:w="2967" w:type="dxa"/>
             <w:shd w:val="clear" w:color="auto" w:fill="660000"/>
             <w:tcMar>
               <w:top w:w="100" w:type="dxa"/>
@@ -1449,7 +394,7 @@
         </w:tc>
         <w:tc>
           <w:tcPr>
-            <w:tcW w:w="5895" w:type="dxa"/>
+            <w:tcW w:w="6033" w:type="dxa"/>
             <w:gridSpan w:val="3"/>
             <w:tcMar>
               <w:top w:w="100" w:type="dxa"/>
@@ -1469,6 +414,9 @@
                 <w:between w:val="nil"/>
               </w:pBdr>
             </w:pPr>
+            <w:r>
+              <w:t>Anshul</w:t>
+            </w:r>
           </w:p>
         </w:tc>
       </w:tr>
@@ -1478,7 +426,7 @@
         </w:trPr>
         <w:tc>
           <w:tcPr>
-            <w:tcW w:w="3105" w:type="dxa"/>
+            <w:tcW w:w="2967" w:type="dxa"/>
             <w:shd w:val="clear" w:color="auto" w:fill="660000"/>
             <w:tcMar>
               <w:top w:w="100" w:type="dxa"/>
@@ -1512,7 +460,7 @@
         </w:tc>
         <w:tc>
           <w:tcPr>
-            <w:tcW w:w="5895" w:type="dxa"/>
+            <w:tcW w:w="6033" w:type="dxa"/>
             <w:gridSpan w:val="3"/>
             <w:tcMar>
               <w:top w:w="100" w:type="dxa"/>
@@ -1532,6 +480,9 @@
                 <w:between w:val="nil"/>
               </w:pBdr>
             </w:pPr>
+            <w:r>
+              <w:t>Thursday 3-5pm</w:t>
+            </w:r>
           </w:p>
         </w:tc>
       </w:tr>
@@ -1541,7 +492,7 @@
         </w:trPr>
         <w:tc>
           <w:tcPr>
-            <w:tcW w:w="3105" w:type="dxa"/>
+            <w:tcW w:w="2967" w:type="dxa"/>
             <w:shd w:val="clear" w:color="auto" w:fill="660000"/>
             <w:tcMar>
               <w:top w:w="100" w:type="dxa"/>
@@ -1581,7 +532,7 @@
         </w:tc>
         <w:tc>
           <w:tcPr>
-            <w:tcW w:w="5895" w:type="dxa"/>
+            <w:tcW w:w="6033" w:type="dxa"/>
             <w:gridSpan w:val="3"/>
             <w:tcMar>
               <w:top w:w="100" w:type="dxa"/>
@@ -1601,13 +552,21 @@
                 <w:between w:val="nil"/>
               </w:pBdr>
             </w:pPr>
+            <w:hyperlink r:id="rId7" w:history="1">
+              <w:r>
+                <w:rPr>
+                  <w:rStyle w:val="Hyperlink"/>
+                </w:rPr>
+                <w:t>https://github.com/santo1827/IAB207-G45</w:t>
+              </w:r>
+            </w:hyperlink>
           </w:p>
         </w:tc>
       </w:tr>
       <w:tr>
         <w:tc>
           <w:tcPr>
-            <w:tcW w:w="3105" w:type="dxa"/>
+            <w:tcW w:w="2967" w:type="dxa"/>
             <w:shd w:val="clear" w:color="auto" w:fill="660000"/>
             <w:tcMar>
               <w:top w:w="100" w:type="dxa"/>
@@ -1640,7 +599,7 @@
         </w:tc>
         <w:tc>
           <w:tcPr>
-            <w:tcW w:w="1155" w:type="dxa"/>
+            <w:tcW w:w="1293" w:type="dxa"/>
             <w:shd w:val="clear" w:color="auto" w:fill="660000"/>
             <w:tcMar>
               <w:top w:w="100" w:type="dxa"/>
@@ -1741,7 +700,7 @@
       <w:tr>
         <w:tc>
           <w:tcPr>
-            <w:tcW w:w="3105" w:type="dxa"/>
+            <w:tcW w:w="2967" w:type="dxa"/>
             <w:tcMar>
               <w:top w:w="100" w:type="dxa"/>
               <w:left w:w="100" w:type="dxa"/>
@@ -1768,13 +727,13 @@
                 <w:sz w:val="20"/>
                 <w:szCs w:val="20"/>
               </w:rPr>
-              <w:t>Person1_full_name</w:t>
+              <w:t>Tiernan Martin</w:t>
             </w:r>
           </w:p>
         </w:tc>
         <w:tc>
           <w:tcPr>
-            <w:tcW w:w="1155" w:type="dxa"/>
+            <w:tcW w:w="1293" w:type="dxa"/>
             <w:tcMar>
               <w:top w:w="100" w:type="dxa"/>
               <w:left w:w="100" w:type="dxa"/>
@@ -1801,7 +760,7 @@
                 <w:sz w:val="20"/>
                 <w:szCs w:val="20"/>
               </w:rPr>
-              <w:t>n123456</w:t>
+              <w:t>n10596381</w:t>
             </w:r>
           </w:p>
         </w:tc>
@@ -1834,7 +793,14 @@
                 <w:sz w:val="20"/>
                 <w:szCs w:val="20"/>
               </w:rPr>
-              <w:t>Person_name@qut.edu.au</w:t>
+              <w:t>n10596381</w:t>
+            </w:r>
+            <w:r>
+              <w:rPr>
+                <w:sz w:val="20"/>
+                <w:szCs w:val="20"/>
+              </w:rPr>
+              <w:t>@qut.edu.au</w:t>
             </w:r>
           </w:p>
         </w:tc>
@@ -1868,7 +834,7 @@
                 <w:sz w:val="20"/>
                 <w:szCs w:val="20"/>
               </w:rPr>
-              <w:t>30</w:t>
+              <w:t>50</w:t>
             </w:r>
           </w:p>
         </w:tc>
@@ -1876,7 +842,7 @@
       <w:tr>
         <w:tc>
           <w:tcPr>
-            <w:tcW w:w="3105" w:type="dxa"/>
+            <w:tcW w:w="2967" w:type="dxa"/>
             <w:tcMar>
               <w:top w:w="100" w:type="dxa"/>
               <w:left w:w="100" w:type="dxa"/>
@@ -1903,13 +869,13 @@
                 <w:sz w:val="20"/>
                 <w:szCs w:val="20"/>
               </w:rPr>
-              <w:t>Person2_full_name</w:t>
+              <w:t>Santo</w:t>
             </w:r>
           </w:p>
         </w:tc>
         <w:tc>
           <w:tcPr>
-            <w:tcW w:w="1155" w:type="dxa"/>
+            <w:tcW w:w="1293" w:type="dxa"/>
             <w:tcMar>
               <w:top w:w="100" w:type="dxa"/>
               <w:left w:w="100" w:type="dxa"/>
@@ -1998,20 +964,13 @@
                 <w:szCs w:val="20"/>
               </w:rPr>
             </w:pPr>
-            <w:r>
-              <w:rPr>
-                <w:sz w:val="20"/>
-                <w:szCs w:val="20"/>
-              </w:rPr>
-              <w:t>30</w:t>
-            </w:r>
           </w:p>
         </w:tc>
       </w:tr>
       <w:tr>
         <w:tc>
           <w:tcPr>
-            <w:tcW w:w="3105" w:type="dxa"/>
+            <w:tcW w:w="2967" w:type="dxa"/>
             <w:tcMar>
               <w:top w:w="100" w:type="dxa"/>
               <w:left w:w="100" w:type="dxa"/>
@@ -2038,13 +997,13 @@
                 <w:sz w:val="20"/>
                 <w:szCs w:val="20"/>
               </w:rPr>
-              <w:t>Person3_full_name</w:t>
+              <w:t>Nodir</w:t>
             </w:r>
           </w:p>
         </w:tc>
         <w:tc>
           <w:tcPr>
-            <w:tcW w:w="1155" w:type="dxa"/>
+            <w:tcW w:w="1293" w:type="dxa"/>
             <w:tcMar>
               <w:top w:w="100" w:type="dxa"/>
               <w:left w:w="100" w:type="dxa"/>
@@ -2133,20 +1092,13 @@
                 <w:szCs w:val="20"/>
               </w:rPr>
             </w:pPr>
-            <w:r>
-              <w:rPr>
-                <w:sz w:val="20"/>
-                <w:szCs w:val="20"/>
-              </w:rPr>
-              <w:t>10</w:t>
-            </w:r>
           </w:p>
         </w:tc>
       </w:tr>
       <w:tr>
         <w:tc>
           <w:tcPr>
-            <w:tcW w:w="3105" w:type="dxa"/>
+            <w:tcW w:w="2967" w:type="dxa"/>
             <w:tcMar>
               <w:top w:w="100" w:type="dxa"/>
               <w:left w:w="100" w:type="dxa"/>
@@ -2173,13 +1125,13 @@
                 <w:sz w:val="20"/>
                 <w:szCs w:val="20"/>
               </w:rPr>
-              <w:t>Person4_full_name</w:t>
+              <w:t>Josh</w:t>
             </w:r>
           </w:p>
         </w:tc>
         <w:tc>
           <w:tcPr>
-            <w:tcW w:w="1155" w:type="dxa"/>
+            <w:tcW w:w="1293" w:type="dxa"/>
             <w:tcMar>
               <w:top w:w="100" w:type="dxa"/>
               <w:left w:w="100" w:type="dxa"/>
@@ -2268,20 +1220,13 @@
                 <w:szCs w:val="20"/>
               </w:rPr>
             </w:pPr>
-            <w:r>
-              <w:rPr>
-                <w:sz w:val="20"/>
-                <w:szCs w:val="20"/>
-              </w:rPr>
-              <w:t>30</w:t>
-            </w:r>
           </w:p>
         </w:tc>
       </w:tr>
       <w:tr>
         <w:tc>
           <w:tcPr>
-            <w:tcW w:w="3105" w:type="dxa"/>
+            <w:tcW w:w="2967" w:type="dxa"/>
             <w:tcMar>
               <w:top w:w="100" w:type="dxa"/>
               <w:left w:w="100" w:type="dxa"/>
@@ -2307,7 +1252,7 @@
         </w:tc>
         <w:tc>
           <w:tcPr>
-            <w:tcW w:w="1155" w:type="dxa"/>
+            <w:tcW w:w="1293" w:type="dxa"/>
             <w:tcMar>
               <w:top w:w="100" w:type="dxa"/>
               <w:left w:w="100" w:type="dxa"/>
@@ -2562,90 +1507,47 @@
               </w:rPr>
               <w:t>Additional comments from any team member (list as full name: comment):</w:t>
             </w:r>
+            <w:r>
+              <w:rPr>
+                <w:sz w:val="20"/>
+                <w:szCs w:val="20"/>
+              </w:rPr>
+              <w:t xml:space="preserve"> Tiernan Martin: at this point in </w:t>
+            </w:r>
+            <w:proofErr w:type="gramStart"/>
+            <w:r>
+              <w:rPr>
+                <w:sz w:val="20"/>
+                <w:szCs w:val="20"/>
+              </w:rPr>
+              <w:t>time</w:t>
+            </w:r>
+            <w:proofErr w:type="gramEnd"/>
+            <w:r>
+              <w:rPr>
+                <w:sz w:val="20"/>
+                <w:szCs w:val="20"/>
+              </w:rPr>
+              <w:t xml:space="preserve"> I have </w:t>
+            </w:r>
+            <w:r>
+              <w:rPr>
+                <w:sz w:val="20"/>
+                <w:szCs w:val="20"/>
+              </w:rPr>
+              <w:t xml:space="preserve">partially filled out the table and requested that the other team members </w:t>
+            </w:r>
+            <w:r>
+              <w:rPr>
+                <w:sz w:val="20"/>
+                <w:szCs w:val="20"/>
+              </w:rPr>
+              <w:t>fill their required sections.</w:t>
+            </w:r>
           </w:p>
         </w:tc>
       </w:tr>
     </w:tbl>
-    <w:p>
-      <w:pPr>
-        <w:pBdr>
-          <w:top w:val="nil"/>
-          <w:left w:val="nil"/>
-          <w:bottom w:val="nil"/>
-          <w:right w:val="nil"/>
-          <w:between w:val="nil"/>
-        </w:pBdr>
-        <w:rPr>
-          <w:i/>
-        </w:rPr>
-      </w:pPr>
-      <w:r>
-        <w:rPr>
-          <w:i/>
-        </w:rPr>
-        <w:t xml:space="preserve">In the example above: person 3 contributed less than the others in a </w:t>
-      </w:r>
-      <w:proofErr w:type="gramStart"/>
-      <w:r>
-        <w:rPr>
-          <w:i/>
-        </w:rPr>
-        <w:t>4 person</w:t>
-      </w:r>
-      <w:proofErr w:type="gramEnd"/>
-      <w:r>
-        <w:rPr>
-          <w:i/>
-        </w:rPr>
-        <w:t xml:space="preserve"> team.</w:t>
-      </w:r>
-    </w:p>
-    <w:p>
-      <w:pPr>
-        <w:rPr>
-          <w:rStyle w:val="Strong"/>
-          <w:rFonts w:ascii="Segoe UI" w:eastAsiaTheme="majorEastAsia" w:hAnsi="Segoe UI" w:cs="Segoe UI"/>
-          <w:b w:val="0"/>
-          <w:bCs w:val="0"/>
-          <w:color w:val="404040"/>
-          <w:sz w:val="32"/>
-          <w:szCs w:val="32"/>
-        </w:rPr>
-      </w:pPr>
-      <w:r>
-        <w:rPr>
-          <w:rFonts w:ascii="Segoe UI" w:hAnsi="Segoe UI" w:cs="Segoe UI"/>
-          <w:color w:val="404040"/>
-        </w:rPr>
-        <w:br/>
-      </w:r>
-    </w:p>
-    <w:p>
-      <w:pPr>
-        <w:rPr>
-          <w:rStyle w:val="Strong"/>
-          <w:rFonts w:ascii="Segoe UI" w:eastAsiaTheme="majorEastAsia" w:hAnsi="Segoe UI" w:cs="Segoe UI"/>
-          <w:b w:val="0"/>
-          <w:bCs w:val="0"/>
-          <w:color w:val="404040"/>
-          <w:sz w:val="32"/>
-          <w:szCs w:val="32"/>
-        </w:rPr>
-      </w:pPr>
-    </w:p>
-    <w:p>
-      <w:pPr>
-        <w:rPr>
-          <w:rStyle w:val="Strong"/>
-          <w:rFonts w:ascii="Segoe UI" w:eastAsiaTheme="majorEastAsia" w:hAnsi="Segoe UI" w:cs="Segoe UI"/>
-          <w:b w:val="0"/>
-          <w:bCs w:val="0"/>
-          <w:color w:val="404040"/>
-          <w:sz w:val="32"/>
-          <w:szCs w:val="32"/>
-        </w:rPr>
-      </w:pPr>
-    </w:p>
     <w:p>
       <w:pPr>
         <w:pBdr>
@@ -2785,7 +1687,7 @@
               <w:rPr>
                 <w:color w:val="0070C0"/>
               </w:rPr>
-              <w:t>Full name of team member 1</w:t>
+              <w:t>Tiernan Martin</w:t>
             </w:r>
           </w:p>
         </w:tc>
@@ -2803,7 +1705,63 @@
               <w:rPr>
                 <w:color w:val="0070C0"/>
               </w:rPr>
-              <w:t>(Contribution statement)</w:t>
+              <w:t>I developed the majority of function</w:t>
+            </w:r>
+            <w:r>
+              <w:rPr>
+                <w:color w:val="0070C0"/>
+              </w:rPr>
+              <w:t xml:space="preserve">ality within the assignment including the database, </w:t>
+            </w:r>
+            <w:r>
+              <w:rPr>
+                <w:color w:val="0070C0"/>
+              </w:rPr>
+              <w:t xml:space="preserve">basic login functionality, </w:t>
+            </w:r>
+            <w:r>
+              <w:rPr>
+                <w:color w:val="0070C0"/>
+              </w:rPr>
+              <w:t xml:space="preserve">event creation, entry of dummy events in </w:t>
+            </w:r>
+            <w:proofErr w:type="spellStart"/>
+            <w:r>
+              <w:rPr>
+                <w:color w:val="0070C0"/>
+              </w:rPr>
+              <w:t>db</w:t>
+            </w:r>
+            <w:proofErr w:type="spellEnd"/>
+            <w:r>
+              <w:rPr>
+                <w:color w:val="0070C0"/>
+              </w:rPr>
+              <w:t xml:space="preserve">, </w:t>
+            </w:r>
+            <w:r>
+              <w:rPr>
+                <w:color w:val="0070C0"/>
+              </w:rPr>
+              <w:t>ticket booking,</w:t>
+            </w:r>
+            <w:r>
+              <w:rPr>
+                <w:color w:val="0070C0"/>
+              </w:rPr>
+              <w:t xml:space="preserve"> event status indication and adjustment, </w:t>
+            </w:r>
+            <w:r>
+              <w:rPr>
+                <w:color w:val="0070C0"/>
+              </w:rPr>
+              <w:t>review posting functionality</w:t>
+            </w:r>
+            <w:r>
+              <w:rPr>
+                <w:color w:val="0070C0"/>
+              </w:rPr>
+              <w:t xml:space="preserve"> and countless minor fixes.</w:t>
             </w:r>
           </w:p>
         </w:tc>
@@ -3051,6 +2009,1949 @@
     </w:p>
     <w:p>
       <w:pPr>
+        <w:rPr>
+          <w:color w:val="0070C0"/>
+          <w:sz w:val="16"/>
+          <w:szCs w:val="16"/>
+        </w:rPr>
+      </w:pPr>
+      <w:r>
+        <w:rPr>
+          <w:color w:val="0070C0"/>
+          <w:sz w:val="16"/>
+          <w:szCs w:val="16"/>
+        </w:rPr>
+        <w:t>4tiernan (53):</w:t>
+      </w:r>
+    </w:p>
+    <w:p>
+      <w:pPr>
+        <w:rPr>
+          <w:color w:val="0070C0"/>
+          <w:sz w:val="16"/>
+          <w:szCs w:val="16"/>
+        </w:rPr>
+      </w:pPr>
+      <w:r>
+        <w:rPr>
+          <w:color w:val="0070C0"/>
+          <w:sz w:val="16"/>
+          <w:szCs w:val="16"/>
+        </w:rPr>
+        <w:t xml:space="preserve">      Uploaded provided template files</w:t>
+      </w:r>
+    </w:p>
+    <w:p>
+      <w:pPr>
+        <w:rPr>
+          <w:color w:val="0070C0"/>
+          <w:sz w:val="16"/>
+          <w:szCs w:val="16"/>
+        </w:rPr>
+      </w:pPr>
+      <w:r>
+        <w:rPr>
+          <w:color w:val="0070C0"/>
+          <w:sz w:val="16"/>
+          <w:szCs w:val="16"/>
+        </w:rPr>
+        <w:t xml:space="preserve">      Added basic login functionality from provided templates</w:t>
+      </w:r>
+    </w:p>
+    <w:p>
+      <w:pPr>
+        <w:rPr>
+          <w:color w:val="0070C0"/>
+          <w:sz w:val="16"/>
+          <w:szCs w:val="16"/>
+        </w:rPr>
+      </w:pPr>
+      <w:r>
+        <w:rPr>
+          <w:color w:val="0070C0"/>
+          <w:sz w:val="16"/>
+          <w:szCs w:val="16"/>
+        </w:rPr>
+        <w:t xml:space="preserve">      Re structured to suit provided code</w:t>
+      </w:r>
+    </w:p>
+    <w:p>
+      <w:pPr>
+        <w:rPr>
+          <w:color w:val="0070C0"/>
+          <w:sz w:val="16"/>
+          <w:szCs w:val="16"/>
+        </w:rPr>
+      </w:pPr>
+      <w:r>
+        <w:rPr>
+          <w:color w:val="0070C0"/>
+          <w:sz w:val="16"/>
+          <w:szCs w:val="16"/>
+        </w:rPr>
+        <w:t xml:space="preserve">      Login page </w:t>
+      </w:r>
+      <w:proofErr w:type="spellStart"/>
+      <w:r>
+        <w:rPr>
+          <w:color w:val="0070C0"/>
+          <w:sz w:val="16"/>
+          <w:szCs w:val="16"/>
+        </w:rPr>
+        <w:t>sortof</w:t>
+      </w:r>
+      <w:proofErr w:type="spellEnd"/>
+      <w:r>
+        <w:rPr>
+          <w:color w:val="0070C0"/>
+          <w:sz w:val="16"/>
+          <w:szCs w:val="16"/>
+        </w:rPr>
+        <w:t xml:space="preserve"> implemented on log out button...</w:t>
+      </w:r>
+    </w:p>
+    <w:p>
+      <w:pPr>
+        <w:rPr>
+          <w:color w:val="0070C0"/>
+          <w:sz w:val="16"/>
+          <w:szCs w:val="16"/>
+        </w:rPr>
+      </w:pPr>
+      <w:r>
+        <w:rPr>
+          <w:color w:val="0070C0"/>
+          <w:sz w:val="16"/>
+          <w:szCs w:val="16"/>
+        </w:rPr>
+        <w:t xml:space="preserve">      Fixed images not displaying by moving static folder out of templates</w:t>
+      </w:r>
+    </w:p>
+    <w:p>
+      <w:pPr>
+        <w:rPr>
+          <w:color w:val="0070C0"/>
+          <w:sz w:val="16"/>
+          <w:szCs w:val="16"/>
+        </w:rPr>
+      </w:pPr>
+      <w:r>
+        <w:rPr>
+          <w:color w:val="0070C0"/>
+          <w:sz w:val="16"/>
+          <w:szCs w:val="16"/>
+        </w:rPr>
+        <w:t xml:space="preserve">      Changed Secret key from default, started to create DB</w:t>
+      </w:r>
+    </w:p>
+    <w:p>
+      <w:pPr>
+        <w:rPr>
+          <w:color w:val="0070C0"/>
+          <w:sz w:val="16"/>
+          <w:szCs w:val="16"/>
+        </w:rPr>
+      </w:pPr>
+      <w:r>
+        <w:rPr>
+          <w:color w:val="0070C0"/>
+          <w:sz w:val="16"/>
+          <w:szCs w:val="16"/>
+        </w:rPr>
+        <w:t xml:space="preserve">      Created event creation form using </w:t>
+      </w:r>
+      <w:proofErr w:type="spellStart"/>
+      <w:r>
+        <w:rPr>
+          <w:color w:val="0070C0"/>
+          <w:sz w:val="16"/>
+          <w:szCs w:val="16"/>
+        </w:rPr>
+        <w:t>wtforms</w:t>
+      </w:r>
+      <w:proofErr w:type="spellEnd"/>
+      <w:r>
+        <w:rPr>
+          <w:color w:val="0070C0"/>
+          <w:sz w:val="16"/>
+          <w:szCs w:val="16"/>
+        </w:rPr>
+        <w:t xml:space="preserve"> and got form data going into database</w:t>
+      </w:r>
+    </w:p>
+    <w:p>
+      <w:pPr>
+        <w:rPr>
+          <w:color w:val="0070C0"/>
+          <w:sz w:val="16"/>
+          <w:szCs w:val="16"/>
+        </w:rPr>
+      </w:pPr>
+      <w:r>
+        <w:rPr>
+          <w:color w:val="0070C0"/>
+          <w:sz w:val="16"/>
+          <w:szCs w:val="16"/>
+        </w:rPr>
+        <w:t xml:space="preserve">      minor fix</w:t>
+      </w:r>
+    </w:p>
+    <w:p>
+      <w:pPr>
+        <w:rPr>
+          <w:color w:val="0070C0"/>
+          <w:sz w:val="16"/>
+          <w:szCs w:val="16"/>
+        </w:rPr>
+      </w:pPr>
+      <w:r>
+        <w:rPr>
+          <w:color w:val="0070C0"/>
+          <w:sz w:val="16"/>
+          <w:szCs w:val="16"/>
+        </w:rPr>
+        <w:t xml:space="preserve">      fixed </w:t>
+      </w:r>
+      <w:proofErr w:type="spellStart"/>
+      <w:r>
+        <w:rPr>
+          <w:color w:val="0070C0"/>
+          <w:sz w:val="16"/>
+          <w:szCs w:val="16"/>
+        </w:rPr>
+        <w:t>event.db</w:t>
+      </w:r>
+      <w:proofErr w:type="spellEnd"/>
+      <w:r>
+        <w:rPr>
+          <w:color w:val="0070C0"/>
+          <w:sz w:val="16"/>
+          <w:szCs w:val="16"/>
+        </w:rPr>
+        <w:t xml:space="preserve"> git syncing</w:t>
+      </w:r>
+    </w:p>
+    <w:p>
+      <w:pPr>
+        <w:rPr>
+          <w:color w:val="0070C0"/>
+          <w:sz w:val="16"/>
+          <w:szCs w:val="16"/>
+        </w:rPr>
+      </w:pPr>
+      <w:r>
+        <w:rPr>
+          <w:color w:val="0070C0"/>
+          <w:sz w:val="16"/>
+          <w:szCs w:val="16"/>
+        </w:rPr>
+        <w:t xml:space="preserve">      Required login to create event, added logout functionality</w:t>
+      </w:r>
+    </w:p>
+    <w:p>
+      <w:pPr>
+        <w:rPr>
+          <w:color w:val="0070C0"/>
+          <w:sz w:val="16"/>
+          <w:szCs w:val="16"/>
+        </w:rPr>
+      </w:pPr>
+      <w:r>
+        <w:rPr>
+          <w:color w:val="0070C0"/>
+          <w:sz w:val="16"/>
+          <w:szCs w:val="16"/>
+        </w:rPr>
+        <w:t xml:space="preserve">      Created all DB tables and improved DB creation and population method</w:t>
+      </w:r>
+    </w:p>
+    <w:p>
+      <w:pPr>
+        <w:rPr>
+          <w:color w:val="0070C0"/>
+          <w:sz w:val="16"/>
+          <w:szCs w:val="16"/>
+        </w:rPr>
+      </w:pPr>
+      <w:r>
+        <w:rPr>
+          <w:color w:val="0070C0"/>
+          <w:sz w:val="16"/>
+          <w:szCs w:val="16"/>
+        </w:rPr>
+        <w:t xml:space="preserve">      Added multiple uploads for event images and added 1st event to </w:t>
+      </w:r>
+      <w:proofErr w:type="spellStart"/>
+      <w:r>
+        <w:rPr>
+          <w:color w:val="0070C0"/>
+          <w:sz w:val="16"/>
+          <w:szCs w:val="16"/>
+        </w:rPr>
+        <w:t>db</w:t>
+      </w:r>
+      <w:proofErr w:type="spellEnd"/>
+    </w:p>
+    <w:p>
+      <w:pPr>
+        <w:rPr>
+          <w:color w:val="0070C0"/>
+          <w:sz w:val="16"/>
+          <w:szCs w:val="16"/>
+        </w:rPr>
+      </w:pPr>
+      <w:r>
+        <w:rPr>
+          <w:color w:val="0070C0"/>
+          <w:sz w:val="16"/>
+          <w:szCs w:val="16"/>
+        </w:rPr>
+        <w:t xml:space="preserve">      Presenting user with success or failure message for event creation form.</w:t>
+      </w:r>
+    </w:p>
+    <w:p>
+      <w:pPr>
+        <w:rPr>
+          <w:color w:val="0070C0"/>
+          <w:sz w:val="16"/>
+          <w:szCs w:val="16"/>
+        </w:rPr>
+      </w:pPr>
+      <w:r>
+        <w:rPr>
+          <w:color w:val="0070C0"/>
+          <w:sz w:val="16"/>
+          <w:szCs w:val="16"/>
+        </w:rPr>
+        <w:t xml:space="preserve">      Merge pull request #24 from santo1827/feature/josh</w:t>
+      </w:r>
+    </w:p>
+    <w:p>
+      <w:pPr>
+        <w:rPr>
+          <w:color w:val="0070C0"/>
+          <w:sz w:val="16"/>
+          <w:szCs w:val="16"/>
+        </w:rPr>
+      </w:pPr>
+      <w:r>
+        <w:rPr>
+          <w:color w:val="0070C0"/>
+          <w:sz w:val="16"/>
+          <w:szCs w:val="16"/>
+        </w:rPr>
+        <w:t xml:space="preserve">      Removed test events</w:t>
+      </w:r>
+    </w:p>
+    <w:p>
+      <w:pPr>
+        <w:rPr>
+          <w:color w:val="0070C0"/>
+          <w:sz w:val="16"/>
+          <w:szCs w:val="16"/>
+        </w:rPr>
+      </w:pPr>
+      <w:r>
+        <w:rPr>
+          <w:color w:val="0070C0"/>
+          <w:sz w:val="16"/>
+          <w:szCs w:val="16"/>
+        </w:rPr>
+        <w:t xml:space="preserve">      Merge pull request #34 from santo1827/feature/</w:t>
+      </w:r>
+      <w:proofErr w:type="spellStart"/>
+      <w:r>
+        <w:rPr>
+          <w:color w:val="0070C0"/>
+          <w:sz w:val="16"/>
+          <w:szCs w:val="16"/>
+        </w:rPr>
+        <w:t>nodir</w:t>
+      </w:r>
+      <w:proofErr w:type="spellEnd"/>
+    </w:p>
+    <w:p>
+      <w:pPr>
+        <w:rPr>
+          <w:color w:val="0070C0"/>
+          <w:sz w:val="16"/>
+          <w:szCs w:val="16"/>
+        </w:rPr>
+      </w:pPr>
+      <w:r>
+        <w:rPr>
+          <w:color w:val="0070C0"/>
+          <w:sz w:val="16"/>
+          <w:szCs w:val="16"/>
+        </w:rPr>
+        <w:t xml:space="preserve">      Added all demo events and fixed image file upload issues</w:t>
+      </w:r>
+    </w:p>
+    <w:p>
+      <w:pPr>
+        <w:rPr>
+          <w:color w:val="0070C0"/>
+          <w:sz w:val="16"/>
+          <w:szCs w:val="16"/>
+        </w:rPr>
+      </w:pPr>
+      <w:r>
+        <w:rPr>
+          <w:color w:val="0070C0"/>
+          <w:sz w:val="16"/>
+          <w:szCs w:val="16"/>
+        </w:rPr>
+        <w:t xml:space="preserve">      Shows events by category on main page, pulls categories from DB, added category icons to DB</w:t>
+      </w:r>
+    </w:p>
+    <w:p>
+      <w:pPr>
+        <w:rPr>
+          <w:color w:val="0070C0"/>
+          <w:sz w:val="16"/>
+          <w:szCs w:val="16"/>
+        </w:rPr>
+      </w:pPr>
+      <w:r>
+        <w:rPr>
+          <w:color w:val="0070C0"/>
+          <w:sz w:val="16"/>
+          <w:szCs w:val="16"/>
+        </w:rPr>
+        <w:t xml:space="preserve">      Added correct event display page with category links</w:t>
+      </w:r>
+    </w:p>
+    <w:p>
+      <w:pPr>
+        <w:rPr>
+          <w:color w:val="0070C0"/>
+          <w:sz w:val="16"/>
+          <w:szCs w:val="16"/>
+        </w:rPr>
+      </w:pPr>
+      <w:r>
+        <w:rPr>
+          <w:color w:val="0070C0"/>
+          <w:sz w:val="16"/>
+          <w:szCs w:val="16"/>
+        </w:rPr>
+        <w:t xml:space="preserve">      Merge branch 'main' of https://github.com/santo1827/IAB207-G45</w:t>
+      </w:r>
+    </w:p>
+    <w:p>
+      <w:pPr>
+        <w:rPr>
+          <w:color w:val="0070C0"/>
+          <w:sz w:val="16"/>
+          <w:szCs w:val="16"/>
+        </w:rPr>
+      </w:pPr>
+      <w:r>
+        <w:rPr>
+          <w:color w:val="0070C0"/>
+          <w:sz w:val="16"/>
+          <w:szCs w:val="16"/>
+        </w:rPr>
+        <w:t xml:space="preserve">      Displaying correct event images in image description page and made entire event link to its page on index.html</w:t>
+      </w:r>
+    </w:p>
+    <w:p>
+      <w:pPr>
+        <w:rPr>
+          <w:color w:val="0070C0"/>
+          <w:sz w:val="16"/>
+          <w:szCs w:val="16"/>
+        </w:rPr>
+      </w:pPr>
+      <w:r>
+        <w:rPr>
+          <w:color w:val="0070C0"/>
+          <w:sz w:val="16"/>
+          <w:szCs w:val="16"/>
+        </w:rPr>
+        <w:t xml:space="preserve">      Flash warning now changes colour for warning type</w:t>
+      </w:r>
+    </w:p>
+    <w:p>
+      <w:pPr>
+        <w:rPr>
+          <w:color w:val="0070C0"/>
+          <w:sz w:val="16"/>
+          <w:szCs w:val="16"/>
+        </w:rPr>
+      </w:pPr>
+      <w:r>
+        <w:rPr>
+          <w:color w:val="0070C0"/>
+          <w:sz w:val="16"/>
+          <w:szCs w:val="16"/>
+        </w:rPr>
+        <w:t xml:space="preserve">      Reorganised file structure for demo</w:t>
+      </w:r>
+    </w:p>
+    <w:p>
+      <w:pPr>
+        <w:rPr>
+          <w:color w:val="0070C0"/>
+          <w:sz w:val="16"/>
+          <w:szCs w:val="16"/>
+        </w:rPr>
+      </w:pPr>
+      <w:r>
+        <w:rPr>
+          <w:color w:val="0070C0"/>
+          <w:sz w:val="16"/>
+          <w:szCs w:val="16"/>
+        </w:rPr>
+        <w:t xml:space="preserve">      created branch</w:t>
+      </w:r>
+    </w:p>
+    <w:p>
+      <w:pPr>
+        <w:rPr>
+          <w:color w:val="0070C0"/>
+          <w:sz w:val="16"/>
+          <w:szCs w:val="16"/>
+        </w:rPr>
+      </w:pPr>
+      <w:r>
+        <w:rPr>
+          <w:color w:val="0070C0"/>
+          <w:sz w:val="16"/>
+          <w:szCs w:val="16"/>
+        </w:rPr>
+        <w:t xml:space="preserve">      Not allowing duplicate event creation and fixed </w:t>
+      </w:r>
+      <w:proofErr w:type="spellStart"/>
+      <w:r>
+        <w:rPr>
+          <w:color w:val="0070C0"/>
+          <w:sz w:val="16"/>
+          <w:szCs w:val="16"/>
+        </w:rPr>
+        <w:t>filepath</w:t>
+      </w:r>
+      <w:proofErr w:type="spellEnd"/>
+      <w:r>
+        <w:rPr>
+          <w:color w:val="0070C0"/>
+          <w:sz w:val="16"/>
+          <w:szCs w:val="16"/>
+        </w:rPr>
+        <w:t xml:space="preserve"> issue for images</w:t>
+      </w:r>
+    </w:p>
+    <w:p>
+      <w:pPr>
+        <w:rPr>
+          <w:color w:val="0070C0"/>
+          <w:sz w:val="16"/>
+          <w:szCs w:val="16"/>
+        </w:rPr>
+      </w:pPr>
+      <w:r>
+        <w:rPr>
+          <w:color w:val="0070C0"/>
+          <w:sz w:val="16"/>
+          <w:szCs w:val="16"/>
+        </w:rPr>
+        <w:t xml:space="preserve">      Fixed category dropdown links</w:t>
+      </w:r>
+    </w:p>
+    <w:p>
+      <w:pPr>
+        <w:rPr>
+          <w:color w:val="0070C0"/>
+          <w:sz w:val="16"/>
+          <w:szCs w:val="16"/>
+        </w:rPr>
+      </w:pPr>
+      <w:r>
+        <w:rPr>
+          <w:color w:val="0070C0"/>
+          <w:sz w:val="16"/>
+          <w:szCs w:val="16"/>
+        </w:rPr>
+        <w:t xml:space="preserve">      fixed book button on main page not doing anything</w:t>
+      </w:r>
+    </w:p>
+    <w:p>
+      <w:pPr>
+        <w:rPr>
+          <w:color w:val="0070C0"/>
+          <w:sz w:val="16"/>
+          <w:szCs w:val="16"/>
+        </w:rPr>
+      </w:pPr>
+      <w:r>
+        <w:rPr>
+          <w:color w:val="0070C0"/>
+          <w:sz w:val="16"/>
+          <w:szCs w:val="16"/>
+        </w:rPr>
+        <w:t xml:space="preserve">      Removed 'Free for QUT Members' no way to check that</w:t>
+      </w:r>
+    </w:p>
+    <w:p>
+      <w:pPr>
+        <w:rPr>
+          <w:color w:val="0070C0"/>
+          <w:sz w:val="16"/>
+          <w:szCs w:val="16"/>
+        </w:rPr>
+      </w:pPr>
+      <w:r>
+        <w:rPr>
+          <w:color w:val="0070C0"/>
+          <w:sz w:val="16"/>
+          <w:szCs w:val="16"/>
+        </w:rPr>
+        <w:t xml:space="preserve">      Added ticket purchase functionality, removed ticket increase/decrease buttons</w:t>
+      </w:r>
+    </w:p>
+    <w:p>
+      <w:pPr>
+        <w:rPr>
+          <w:color w:val="0070C0"/>
+          <w:sz w:val="16"/>
+          <w:szCs w:val="16"/>
+        </w:rPr>
+      </w:pPr>
+      <w:r>
+        <w:rPr>
+          <w:color w:val="0070C0"/>
+          <w:sz w:val="16"/>
+          <w:szCs w:val="16"/>
+        </w:rPr>
+        <w:t xml:space="preserve">      calculating remaining event tickets, only allowing that many to be purchased and displaying remaining tickets on event page</w:t>
+      </w:r>
+    </w:p>
+    <w:p>
+      <w:pPr>
+        <w:rPr>
+          <w:color w:val="0070C0"/>
+          <w:sz w:val="16"/>
+          <w:szCs w:val="16"/>
+        </w:rPr>
+      </w:pPr>
+      <w:r>
+        <w:rPr>
+          <w:color w:val="0070C0"/>
+          <w:sz w:val="16"/>
+          <w:szCs w:val="16"/>
+        </w:rPr>
+        <w:t xml:space="preserve">      Showing event status on event details page and main page</w:t>
+      </w:r>
+    </w:p>
+    <w:p>
+      <w:pPr>
+        <w:rPr>
+          <w:color w:val="0070C0"/>
+          <w:sz w:val="16"/>
+          <w:szCs w:val="16"/>
+        </w:rPr>
+      </w:pPr>
+      <w:r>
+        <w:rPr>
+          <w:color w:val="0070C0"/>
+          <w:sz w:val="16"/>
+          <w:szCs w:val="16"/>
+        </w:rPr>
+        <w:t xml:space="preserve">      Only allowing tickets to be purchased on open events and removed book button from events on main page</w:t>
+      </w:r>
+    </w:p>
+    <w:p>
+      <w:pPr>
+        <w:rPr>
+          <w:color w:val="0070C0"/>
+          <w:sz w:val="16"/>
+          <w:szCs w:val="16"/>
+        </w:rPr>
+      </w:pPr>
+      <w:r>
+        <w:rPr>
+          <w:color w:val="0070C0"/>
+          <w:sz w:val="16"/>
+          <w:szCs w:val="16"/>
+        </w:rPr>
+        <w:t xml:space="preserve">      removed dot next to experience level on main page</w:t>
+      </w:r>
+    </w:p>
+    <w:p>
+      <w:pPr>
+        <w:rPr>
+          <w:color w:val="0070C0"/>
+          <w:sz w:val="16"/>
+          <w:szCs w:val="16"/>
+        </w:rPr>
+      </w:pPr>
+      <w:r>
+        <w:rPr>
+          <w:color w:val="0070C0"/>
+          <w:sz w:val="16"/>
+          <w:szCs w:val="16"/>
+        </w:rPr>
+        <w:t xml:space="preserve">      Main </w:t>
+      </w:r>
+      <w:proofErr w:type="gramStart"/>
+      <w:r>
+        <w:rPr>
+          <w:color w:val="0070C0"/>
+          <w:sz w:val="16"/>
+          <w:szCs w:val="16"/>
+        </w:rPr>
+        <w:t>page</w:t>
+      </w:r>
+      <w:proofErr w:type="gramEnd"/>
+      <w:r>
+        <w:rPr>
+          <w:color w:val="0070C0"/>
+          <w:sz w:val="16"/>
+          <w:szCs w:val="16"/>
+        </w:rPr>
+        <w:t xml:space="preserve"> show upcoming and past events</w:t>
+      </w:r>
+    </w:p>
+    <w:p>
+      <w:pPr>
+        <w:rPr>
+          <w:color w:val="0070C0"/>
+          <w:sz w:val="16"/>
+          <w:szCs w:val="16"/>
+        </w:rPr>
+      </w:pPr>
+      <w:r>
+        <w:rPr>
+          <w:color w:val="0070C0"/>
+          <w:sz w:val="16"/>
+          <w:szCs w:val="16"/>
+        </w:rPr>
+        <w:t xml:space="preserve">      Removed duplicate </w:t>
+      </w:r>
+      <w:proofErr w:type="spellStart"/>
+      <w:r>
+        <w:rPr>
+          <w:color w:val="0070C0"/>
+          <w:sz w:val="16"/>
+          <w:szCs w:val="16"/>
+        </w:rPr>
+        <w:t>view_event</w:t>
+      </w:r>
+      <w:proofErr w:type="spellEnd"/>
+      <w:r>
+        <w:rPr>
+          <w:color w:val="0070C0"/>
+          <w:sz w:val="16"/>
+          <w:szCs w:val="16"/>
+        </w:rPr>
+        <w:t xml:space="preserve"> and </w:t>
+      </w:r>
+      <w:proofErr w:type="spellStart"/>
+      <w:r>
+        <w:rPr>
+          <w:color w:val="0070C0"/>
+          <w:sz w:val="16"/>
+          <w:szCs w:val="16"/>
+        </w:rPr>
+        <w:t>event_details</w:t>
+      </w:r>
+      <w:proofErr w:type="spellEnd"/>
+      <w:r>
+        <w:rPr>
+          <w:color w:val="0070C0"/>
+          <w:sz w:val="16"/>
+          <w:szCs w:val="16"/>
+        </w:rPr>
+        <w:t xml:space="preserve"> views and fixed 'My Events' page</w:t>
+      </w:r>
+    </w:p>
+    <w:p>
+      <w:pPr>
+        <w:rPr>
+          <w:color w:val="0070C0"/>
+          <w:sz w:val="16"/>
+          <w:szCs w:val="16"/>
+        </w:rPr>
+      </w:pPr>
+      <w:r>
+        <w:rPr>
+          <w:color w:val="0070C0"/>
+          <w:sz w:val="16"/>
+          <w:szCs w:val="16"/>
+        </w:rPr>
+        <w:t xml:space="preserve">      Fixed hyperlinks for My Events all being linked to view event</w:t>
+      </w:r>
+    </w:p>
+    <w:p>
+      <w:pPr>
+        <w:rPr>
+          <w:color w:val="0070C0"/>
+          <w:sz w:val="16"/>
+          <w:szCs w:val="16"/>
+        </w:rPr>
+      </w:pPr>
+      <w:r>
+        <w:rPr>
+          <w:color w:val="0070C0"/>
+          <w:sz w:val="16"/>
+          <w:szCs w:val="16"/>
+        </w:rPr>
+        <w:t xml:space="preserve">      Event editing functionality implemented</w:t>
+      </w:r>
+    </w:p>
+    <w:p>
+      <w:pPr>
+        <w:rPr>
+          <w:color w:val="0070C0"/>
+          <w:sz w:val="16"/>
+          <w:szCs w:val="16"/>
+        </w:rPr>
+      </w:pPr>
+      <w:r>
+        <w:rPr>
+          <w:color w:val="0070C0"/>
+          <w:sz w:val="16"/>
+          <w:szCs w:val="16"/>
+        </w:rPr>
+        <w:t xml:space="preserve">      Only allowing unsold tickets to be removed and warning when replacing event image</w:t>
+      </w:r>
+    </w:p>
+    <w:p>
+      <w:pPr>
+        <w:rPr>
+          <w:color w:val="0070C0"/>
+          <w:sz w:val="16"/>
+          <w:szCs w:val="16"/>
+        </w:rPr>
+      </w:pPr>
+      <w:r>
+        <w:rPr>
+          <w:color w:val="0070C0"/>
+          <w:sz w:val="16"/>
+          <w:szCs w:val="16"/>
+        </w:rPr>
+        <w:t xml:space="preserve">      event cancelation functionality</w:t>
+      </w:r>
+    </w:p>
+    <w:p>
+      <w:pPr>
+        <w:rPr>
+          <w:color w:val="0070C0"/>
+          <w:sz w:val="16"/>
+          <w:szCs w:val="16"/>
+        </w:rPr>
+      </w:pPr>
+      <w:r>
+        <w:rPr>
+          <w:color w:val="0070C0"/>
+          <w:sz w:val="16"/>
+          <w:szCs w:val="16"/>
+        </w:rPr>
+        <w:lastRenderedPageBreak/>
+        <w:t xml:space="preserve">      Fixed my events page event status display</w:t>
+      </w:r>
+    </w:p>
+    <w:p>
+      <w:pPr>
+        <w:rPr>
+          <w:color w:val="0070C0"/>
+          <w:sz w:val="16"/>
+          <w:szCs w:val="16"/>
+        </w:rPr>
+      </w:pPr>
+      <w:r>
+        <w:rPr>
+          <w:color w:val="0070C0"/>
+          <w:sz w:val="16"/>
+          <w:szCs w:val="16"/>
+        </w:rPr>
+        <w:t xml:space="preserve">      fixing user booking history not working</w:t>
+      </w:r>
+    </w:p>
+    <w:p>
+      <w:pPr>
+        <w:rPr>
+          <w:color w:val="0070C0"/>
+          <w:sz w:val="16"/>
+          <w:szCs w:val="16"/>
+        </w:rPr>
+      </w:pPr>
+      <w:r>
+        <w:rPr>
+          <w:color w:val="0070C0"/>
+          <w:sz w:val="16"/>
+          <w:szCs w:val="16"/>
+        </w:rPr>
+        <w:t xml:space="preserve">      fixed categories drop down not always working</w:t>
+      </w:r>
+    </w:p>
+    <w:p>
+      <w:pPr>
+        <w:rPr>
+          <w:color w:val="0070C0"/>
+          <w:sz w:val="16"/>
+          <w:szCs w:val="16"/>
+        </w:rPr>
+      </w:pPr>
+      <w:r>
+        <w:rPr>
+          <w:color w:val="0070C0"/>
+          <w:sz w:val="16"/>
+          <w:szCs w:val="16"/>
+        </w:rPr>
+        <w:t xml:space="preserve">      Implemented commenting functionality</w:t>
+      </w:r>
+    </w:p>
+    <w:p>
+      <w:pPr>
+        <w:rPr>
+          <w:color w:val="0070C0"/>
+          <w:sz w:val="16"/>
+          <w:szCs w:val="16"/>
+        </w:rPr>
+      </w:pPr>
+      <w:r>
+        <w:rPr>
+          <w:color w:val="0070C0"/>
+          <w:sz w:val="16"/>
+          <w:szCs w:val="16"/>
+        </w:rPr>
+        <w:t xml:space="preserve">      Added street address to register form</w:t>
+      </w:r>
+    </w:p>
+    <w:p>
+      <w:pPr>
+        <w:rPr>
+          <w:color w:val="0070C0"/>
+          <w:sz w:val="16"/>
+          <w:szCs w:val="16"/>
+        </w:rPr>
+      </w:pPr>
+      <w:r>
+        <w:rPr>
+          <w:color w:val="0070C0"/>
+          <w:sz w:val="16"/>
+          <w:szCs w:val="16"/>
+        </w:rPr>
+        <w:t xml:space="preserve">      implemented search functionality fully</w:t>
+      </w:r>
+    </w:p>
+    <w:p>
+      <w:pPr>
+        <w:rPr>
+          <w:color w:val="0070C0"/>
+          <w:sz w:val="16"/>
+          <w:szCs w:val="16"/>
+        </w:rPr>
+      </w:pPr>
+      <w:r>
+        <w:rPr>
+          <w:color w:val="0070C0"/>
+          <w:sz w:val="16"/>
+          <w:szCs w:val="16"/>
+        </w:rPr>
+        <w:t xml:space="preserve">      created zip of contents for temporary submission</w:t>
+      </w:r>
+    </w:p>
+    <w:p>
+      <w:pPr>
+        <w:rPr>
+          <w:color w:val="0070C0"/>
+          <w:sz w:val="16"/>
+          <w:szCs w:val="16"/>
+        </w:rPr>
+      </w:pPr>
+      <w:r>
+        <w:rPr>
+          <w:color w:val="0070C0"/>
+          <w:sz w:val="16"/>
+          <w:szCs w:val="16"/>
+        </w:rPr>
+        <w:t xml:space="preserve">      update</w:t>
+      </w:r>
+    </w:p>
+    <w:p>
+      <w:pPr>
+        <w:rPr>
+          <w:color w:val="0070C0"/>
+          <w:sz w:val="16"/>
+          <w:szCs w:val="16"/>
+        </w:rPr>
+      </w:pPr>
+      <w:r>
+        <w:rPr>
+          <w:color w:val="0070C0"/>
+          <w:sz w:val="16"/>
+          <w:szCs w:val="16"/>
+        </w:rPr>
+        <w:t xml:space="preserve">      Displaying order id when completing and viewing orders</w:t>
+      </w:r>
+    </w:p>
+    <w:p>
+      <w:pPr>
+        <w:rPr>
+          <w:color w:val="0070C0"/>
+          <w:sz w:val="16"/>
+          <w:szCs w:val="16"/>
+        </w:rPr>
+      </w:pPr>
+      <w:r>
+        <w:rPr>
+          <w:color w:val="0070C0"/>
+          <w:sz w:val="16"/>
+          <w:szCs w:val="16"/>
+        </w:rPr>
+        <w:t xml:space="preserve">      removed page navigator at bottom of page (not required)</w:t>
+      </w:r>
+    </w:p>
+    <w:p>
+      <w:pPr>
+        <w:rPr>
+          <w:color w:val="0070C0"/>
+          <w:sz w:val="16"/>
+          <w:szCs w:val="16"/>
+        </w:rPr>
+      </w:pPr>
+      <w:r>
+        <w:rPr>
+          <w:color w:val="0070C0"/>
+          <w:sz w:val="16"/>
+          <w:szCs w:val="16"/>
+        </w:rPr>
+        <w:t xml:space="preserve">      Fixed my bookings to only get current user's bookings</w:t>
+      </w:r>
+    </w:p>
+    <w:p>
+      <w:pPr>
+        <w:rPr>
+          <w:color w:val="0070C0"/>
+          <w:sz w:val="16"/>
+          <w:szCs w:val="16"/>
+        </w:rPr>
+      </w:pPr>
+      <w:r>
+        <w:rPr>
+          <w:color w:val="0070C0"/>
+          <w:sz w:val="16"/>
+          <w:szCs w:val="16"/>
+        </w:rPr>
+        <w:t xml:space="preserve">      Merge pull request #65 from santo1827/</w:t>
+      </w:r>
+      <w:proofErr w:type="spellStart"/>
+      <w:r>
+        <w:rPr>
+          <w:color w:val="0070C0"/>
+          <w:sz w:val="16"/>
+          <w:szCs w:val="16"/>
+        </w:rPr>
+        <w:t>tiernan</w:t>
+      </w:r>
+      <w:proofErr w:type="spellEnd"/>
+    </w:p>
+    <w:p>
+      <w:pPr>
+        <w:rPr>
+          <w:color w:val="0070C0"/>
+          <w:sz w:val="16"/>
+          <w:szCs w:val="16"/>
+        </w:rPr>
+      </w:pPr>
+      <w:r>
+        <w:rPr>
+          <w:color w:val="0070C0"/>
+          <w:sz w:val="16"/>
+          <w:szCs w:val="16"/>
+        </w:rPr>
+        <w:t xml:space="preserve">      update</w:t>
+      </w:r>
+    </w:p>
+    <w:p>
+      <w:pPr>
+        <w:rPr>
+          <w:color w:val="0070C0"/>
+          <w:sz w:val="16"/>
+          <w:szCs w:val="16"/>
+        </w:rPr>
+      </w:pPr>
+      <w:r>
+        <w:rPr>
+          <w:color w:val="0070C0"/>
+          <w:sz w:val="16"/>
+          <w:szCs w:val="16"/>
+        </w:rPr>
+        <w:t xml:space="preserve">      Merge branch 'main' of https://github.com/santo1827/IAB207-G45</w:t>
+      </w:r>
+    </w:p>
+    <w:p>
+      <w:pPr>
+        <w:rPr>
+          <w:color w:val="0070C0"/>
+          <w:sz w:val="16"/>
+          <w:szCs w:val="16"/>
+        </w:rPr>
+      </w:pPr>
+    </w:p>
+    <w:p>
+      <w:pPr>
+        <w:rPr>
+          <w:color w:val="0070C0"/>
+          <w:sz w:val="16"/>
+          <w:szCs w:val="16"/>
+        </w:rPr>
+      </w:pPr>
+      <w:r>
+        <w:rPr>
+          <w:color w:val="0070C0"/>
+          <w:sz w:val="16"/>
+          <w:szCs w:val="16"/>
+        </w:rPr>
+        <w:t>Nodir (8):</w:t>
+      </w:r>
+    </w:p>
+    <w:p>
+      <w:pPr>
+        <w:rPr>
+          <w:color w:val="0070C0"/>
+          <w:sz w:val="16"/>
+          <w:szCs w:val="16"/>
+        </w:rPr>
+      </w:pPr>
+      <w:r>
+        <w:rPr>
+          <w:color w:val="0070C0"/>
+          <w:sz w:val="16"/>
+          <w:szCs w:val="16"/>
+        </w:rPr>
+        <w:t xml:space="preserve">      Update README</w:t>
+      </w:r>
+    </w:p>
+    <w:p>
+      <w:pPr>
+        <w:rPr>
+          <w:color w:val="0070C0"/>
+          <w:sz w:val="16"/>
+          <w:szCs w:val="16"/>
+        </w:rPr>
+      </w:pPr>
+      <w:r>
+        <w:rPr>
+          <w:color w:val="0070C0"/>
+          <w:sz w:val="16"/>
+          <w:szCs w:val="16"/>
+        </w:rPr>
+        <w:t xml:space="preserve">      Front-end Web Pages</w:t>
+      </w:r>
+    </w:p>
+    <w:p>
+      <w:pPr>
+        <w:rPr>
+          <w:color w:val="0070C0"/>
+          <w:sz w:val="16"/>
+          <w:szCs w:val="16"/>
+        </w:rPr>
+      </w:pPr>
+      <w:r>
+        <w:rPr>
+          <w:color w:val="0070C0"/>
+          <w:sz w:val="16"/>
+          <w:szCs w:val="16"/>
+        </w:rPr>
+        <w:t xml:space="preserve">      Front-end Web Pages</w:t>
+      </w:r>
+    </w:p>
+    <w:p>
+      <w:pPr>
+        <w:rPr>
+          <w:color w:val="0070C0"/>
+          <w:sz w:val="16"/>
+          <w:szCs w:val="16"/>
+        </w:rPr>
+      </w:pPr>
+      <w:r>
+        <w:rPr>
+          <w:color w:val="0070C0"/>
+          <w:sz w:val="16"/>
+          <w:szCs w:val="16"/>
+        </w:rPr>
+        <w:t xml:space="preserve">      Added </w:t>
+      </w:r>
+      <w:proofErr w:type="spellStart"/>
+      <w:r>
+        <w:rPr>
+          <w:color w:val="0070C0"/>
+          <w:sz w:val="16"/>
+          <w:szCs w:val="16"/>
+        </w:rPr>
+        <w:t>LogIn</w:t>
+      </w:r>
+      <w:proofErr w:type="spellEnd"/>
+      <w:r>
+        <w:rPr>
+          <w:color w:val="0070C0"/>
+          <w:sz w:val="16"/>
+          <w:szCs w:val="16"/>
+        </w:rPr>
+        <w:t xml:space="preserve"> and </w:t>
+      </w:r>
+      <w:proofErr w:type="spellStart"/>
+      <w:r>
+        <w:rPr>
+          <w:color w:val="0070C0"/>
+          <w:sz w:val="16"/>
+          <w:szCs w:val="16"/>
+        </w:rPr>
+        <w:t>SignUp</w:t>
+      </w:r>
+      <w:proofErr w:type="spellEnd"/>
+      <w:r>
+        <w:rPr>
+          <w:color w:val="0070C0"/>
+          <w:sz w:val="16"/>
+          <w:szCs w:val="16"/>
+        </w:rPr>
+        <w:t xml:space="preserve"> pages, </w:t>
+      </w:r>
+      <w:proofErr w:type="gramStart"/>
+      <w:r>
+        <w:rPr>
+          <w:color w:val="0070C0"/>
+          <w:sz w:val="16"/>
+          <w:szCs w:val="16"/>
+        </w:rPr>
+        <w:t>Changed</w:t>
+      </w:r>
+      <w:proofErr w:type="gramEnd"/>
+      <w:r>
+        <w:rPr>
+          <w:color w:val="0070C0"/>
+          <w:sz w:val="16"/>
+          <w:szCs w:val="16"/>
+        </w:rPr>
+        <w:t xml:space="preserve"> base.html to render different messages depending on the </w:t>
+      </w:r>
+      <w:proofErr w:type="gramStart"/>
+      <w:r>
+        <w:rPr>
+          <w:color w:val="0070C0"/>
+          <w:sz w:val="16"/>
+          <w:szCs w:val="16"/>
+        </w:rPr>
+        <w:t>users</w:t>
+      </w:r>
+      <w:proofErr w:type="gramEnd"/>
+      <w:r>
+        <w:rPr>
+          <w:color w:val="0070C0"/>
+          <w:sz w:val="16"/>
+          <w:szCs w:val="16"/>
+        </w:rPr>
+        <w:t xml:space="preserve"> status (Logged in or not)</w:t>
+      </w:r>
+    </w:p>
+    <w:p>
+      <w:pPr>
+        <w:rPr>
+          <w:color w:val="0070C0"/>
+          <w:sz w:val="16"/>
+          <w:szCs w:val="16"/>
+        </w:rPr>
+      </w:pPr>
+      <w:r>
+        <w:rPr>
+          <w:color w:val="0070C0"/>
+          <w:sz w:val="16"/>
+          <w:szCs w:val="16"/>
+        </w:rPr>
+        <w:t xml:space="preserve">      Added unique IDs to all forms and buttons for accessibility and clarity. Updated </w:t>
+      </w:r>
+      <w:proofErr w:type="spellStart"/>
+      <w:r>
+        <w:rPr>
+          <w:color w:val="0070C0"/>
+          <w:sz w:val="16"/>
+          <w:szCs w:val="16"/>
+        </w:rPr>
+        <w:t>UserBookingHistory</w:t>
+      </w:r>
+      <w:proofErr w:type="spellEnd"/>
+      <w:r>
+        <w:rPr>
+          <w:color w:val="0070C0"/>
+          <w:sz w:val="16"/>
+          <w:szCs w:val="16"/>
+        </w:rPr>
+        <w:t xml:space="preserve"> page (now accessible via the Booking History button). Enhanced </w:t>
+      </w:r>
+      <w:proofErr w:type="spellStart"/>
+      <w:r>
+        <w:rPr>
+          <w:color w:val="0070C0"/>
+          <w:sz w:val="16"/>
+          <w:szCs w:val="16"/>
+        </w:rPr>
+        <w:t>CreatedEvents</w:t>
+      </w:r>
+      <w:proofErr w:type="spellEnd"/>
+      <w:r>
+        <w:rPr>
+          <w:color w:val="0070C0"/>
+          <w:sz w:val="16"/>
+          <w:szCs w:val="16"/>
+        </w:rPr>
+        <w:t xml:space="preserve"> page with View, Edit, and Delete functionality (partial implementation </w:t>
+      </w:r>
+      <w:proofErr w:type="spellStart"/>
+      <w:r>
+        <w:rPr>
+          <w:color w:val="0070C0"/>
+          <w:sz w:val="16"/>
+          <w:szCs w:val="16"/>
+        </w:rPr>
+        <w:t>ÔÇö</w:t>
+      </w:r>
+      <w:proofErr w:type="spellEnd"/>
+      <w:r>
+        <w:rPr>
+          <w:color w:val="0070C0"/>
+          <w:sz w:val="16"/>
+          <w:szCs w:val="16"/>
+        </w:rPr>
+        <w:t xml:space="preserve"> pending account creation for full testing).</w:t>
+      </w:r>
+    </w:p>
+    <w:p>
+      <w:pPr>
+        <w:rPr>
+          <w:color w:val="0070C0"/>
+          <w:sz w:val="16"/>
+          <w:szCs w:val="16"/>
+        </w:rPr>
+      </w:pPr>
+      <w:r>
+        <w:rPr>
+          <w:color w:val="0070C0"/>
+          <w:sz w:val="16"/>
+          <w:szCs w:val="16"/>
+        </w:rPr>
+        <w:t xml:space="preserve">      </w:t>
+      </w:r>
+      <w:proofErr w:type="spellStart"/>
+      <w:r>
+        <w:rPr>
+          <w:color w:val="0070C0"/>
+          <w:sz w:val="16"/>
+          <w:szCs w:val="16"/>
+        </w:rPr>
+        <w:t>MyEvents</w:t>
+      </w:r>
+      <w:proofErr w:type="spellEnd"/>
+      <w:r>
+        <w:rPr>
+          <w:color w:val="0070C0"/>
+          <w:sz w:val="16"/>
+          <w:szCs w:val="16"/>
+        </w:rPr>
+        <w:t xml:space="preserve"> and </w:t>
+      </w:r>
+      <w:proofErr w:type="spellStart"/>
+      <w:r>
+        <w:rPr>
+          <w:color w:val="0070C0"/>
+          <w:sz w:val="16"/>
+          <w:szCs w:val="16"/>
+        </w:rPr>
+        <w:t>MyBookinsHistory</w:t>
+      </w:r>
+      <w:proofErr w:type="spellEnd"/>
+      <w:r>
+        <w:rPr>
+          <w:color w:val="0070C0"/>
+          <w:sz w:val="16"/>
+          <w:szCs w:val="16"/>
+        </w:rPr>
+        <w:t xml:space="preserve"> is only accessible and visible to logged in users</w:t>
+      </w:r>
+    </w:p>
+    <w:p>
+      <w:pPr>
+        <w:rPr>
+          <w:color w:val="0070C0"/>
+          <w:sz w:val="16"/>
+          <w:szCs w:val="16"/>
+        </w:rPr>
+      </w:pPr>
+      <w:r>
+        <w:rPr>
+          <w:color w:val="0070C0"/>
+          <w:sz w:val="16"/>
+          <w:szCs w:val="16"/>
+        </w:rPr>
+        <w:t xml:space="preserve">      added login</w:t>
+      </w:r>
+    </w:p>
+    <w:p>
+      <w:pPr>
+        <w:rPr>
+          <w:color w:val="0070C0"/>
+          <w:sz w:val="16"/>
+          <w:szCs w:val="16"/>
+        </w:rPr>
+      </w:pPr>
+      <w:r>
+        <w:rPr>
+          <w:color w:val="0070C0"/>
+          <w:sz w:val="16"/>
+          <w:szCs w:val="16"/>
+        </w:rPr>
+        <w:t xml:space="preserve">      changed time </w:t>
+      </w:r>
+      <w:proofErr w:type="spellStart"/>
+      <w:r>
+        <w:rPr>
+          <w:color w:val="0070C0"/>
+          <w:sz w:val="16"/>
+          <w:szCs w:val="16"/>
+        </w:rPr>
+        <w:t>formating</w:t>
+      </w:r>
+      <w:proofErr w:type="spellEnd"/>
+      <w:r>
+        <w:rPr>
+          <w:color w:val="0070C0"/>
+          <w:sz w:val="16"/>
+          <w:szCs w:val="16"/>
+        </w:rPr>
+        <w:t xml:space="preserve"> in cards</w:t>
+      </w:r>
+    </w:p>
+    <w:p>
+      <w:pPr>
+        <w:rPr>
+          <w:color w:val="0070C0"/>
+          <w:sz w:val="16"/>
+          <w:szCs w:val="16"/>
+        </w:rPr>
+      </w:pPr>
+    </w:p>
+    <w:p>
+      <w:pPr>
+        <w:rPr>
+          <w:color w:val="0070C0"/>
+          <w:sz w:val="16"/>
+          <w:szCs w:val="16"/>
+        </w:rPr>
+      </w:pPr>
+      <w:r>
+        <w:rPr>
+          <w:color w:val="0070C0"/>
+          <w:sz w:val="16"/>
+          <w:szCs w:val="16"/>
+        </w:rPr>
+        <w:t>joshmitchell456 (2):</w:t>
+      </w:r>
+    </w:p>
+    <w:p>
+      <w:pPr>
+        <w:rPr>
+          <w:color w:val="0070C0"/>
+          <w:sz w:val="16"/>
+          <w:szCs w:val="16"/>
+        </w:rPr>
+      </w:pPr>
+      <w:r>
+        <w:rPr>
+          <w:color w:val="0070C0"/>
+          <w:sz w:val="16"/>
+          <w:szCs w:val="16"/>
+        </w:rPr>
+        <w:t xml:space="preserve">      Update README.md</w:t>
+      </w:r>
+    </w:p>
+    <w:p>
+      <w:pPr>
+        <w:rPr>
+          <w:color w:val="0070C0"/>
+          <w:sz w:val="16"/>
+          <w:szCs w:val="16"/>
+        </w:rPr>
+      </w:pPr>
+      <w:r>
+        <w:rPr>
+          <w:color w:val="0070C0"/>
+          <w:sz w:val="16"/>
+          <w:szCs w:val="16"/>
+        </w:rPr>
+        <w:t xml:space="preserve">      Add custom error pages and handlers</w:t>
+      </w:r>
+    </w:p>
+    <w:p>
+      <w:pPr>
+        <w:rPr>
+          <w:color w:val="0070C0"/>
+          <w:sz w:val="16"/>
+          <w:szCs w:val="16"/>
+        </w:rPr>
+      </w:pPr>
+    </w:p>
+    <w:p>
+      <w:pPr>
+        <w:rPr>
+          <w:color w:val="0070C0"/>
+          <w:sz w:val="16"/>
+          <w:szCs w:val="16"/>
+        </w:rPr>
+      </w:pPr>
+      <w:r>
+        <w:rPr>
+          <w:color w:val="0070C0"/>
+          <w:sz w:val="16"/>
+          <w:szCs w:val="16"/>
+        </w:rPr>
+        <w:t>santo1827 (20):</w:t>
+      </w:r>
+    </w:p>
+    <w:p>
+      <w:pPr>
+        <w:rPr>
+          <w:color w:val="0070C0"/>
+          <w:sz w:val="16"/>
+          <w:szCs w:val="16"/>
+        </w:rPr>
+      </w:pPr>
+      <w:r>
+        <w:rPr>
+          <w:color w:val="0070C0"/>
+          <w:sz w:val="16"/>
+          <w:szCs w:val="16"/>
+        </w:rPr>
+        <w:t xml:space="preserve">      Initial commit</w:t>
+      </w:r>
+    </w:p>
+    <w:p>
+      <w:pPr>
+        <w:rPr>
+          <w:color w:val="0070C0"/>
+          <w:sz w:val="16"/>
+          <w:szCs w:val="16"/>
+        </w:rPr>
+      </w:pPr>
+      <w:r>
+        <w:rPr>
+          <w:color w:val="0070C0"/>
+          <w:sz w:val="16"/>
+          <w:szCs w:val="16"/>
+        </w:rPr>
+        <w:t xml:space="preserve">      fix </w:t>
+      </w:r>
+      <w:proofErr w:type="gramStart"/>
+      <w:r>
+        <w:rPr>
+          <w:color w:val="0070C0"/>
+          <w:sz w:val="16"/>
+          <w:szCs w:val="16"/>
+        </w:rPr>
+        <w:t>for .</w:t>
+      </w:r>
+      <w:proofErr w:type="spellStart"/>
+      <w:r>
+        <w:rPr>
+          <w:color w:val="0070C0"/>
+          <w:sz w:val="16"/>
+          <w:szCs w:val="16"/>
+        </w:rPr>
+        <w:t>gitignore</w:t>
+      </w:r>
+      <w:proofErr w:type="spellEnd"/>
+      <w:proofErr w:type="gramEnd"/>
+    </w:p>
+    <w:p>
+      <w:pPr>
+        <w:rPr>
+          <w:color w:val="0070C0"/>
+          <w:sz w:val="16"/>
+          <w:szCs w:val="16"/>
+        </w:rPr>
+      </w:pPr>
+      <w:r>
+        <w:rPr>
+          <w:color w:val="0070C0"/>
+          <w:sz w:val="16"/>
+          <w:szCs w:val="16"/>
+        </w:rPr>
+        <w:t xml:space="preserve">      starting to route pages correctly</w:t>
+      </w:r>
+    </w:p>
+    <w:p>
+      <w:pPr>
+        <w:rPr>
+          <w:color w:val="0070C0"/>
+          <w:sz w:val="16"/>
+          <w:szCs w:val="16"/>
+        </w:rPr>
+      </w:pPr>
+      <w:r>
+        <w:rPr>
+          <w:color w:val="0070C0"/>
+          <w:sz w:val="16"/>
+          <w:szCs w:val="16"/>
+        </w:rPr>
+        <w:t xml:space="preserve">      Project Config</w:t>
+      </w:r>
+    </w:p>
+    <w:p>
+      <w:pPr>
+        <w:rPr>
+          <w:color w:val="0070C0"/>
+          <w:sz w:val="16"/>
+          <w:szCs w:val="16"/>
+        </w:rPr>
+      </w:pPr>
+      <w:r>
+        <w:rPr>
+          <w:color w:val="0070C0"/>
+          <w:sz w:val="16"/>
+          <w:szCs w:val="16"/>
+        </w:rPr>
+        <w:t xml:space="preserve">      fixed page routing and added template functionality</w:t>
+      </w:r>
+    </w:p>
+    <w:p>
+      <w:pPr>
+        <w:rPr>
+          <w:color w:val="0070C0"/>
+          <w:sz w:val="16"/>
+          <w:szCs w:val="16"/>
+        </w:rPr>
+      </w:pPr>
+      <w:r>
+        <w:rPr>
+          <w:color w:val="0070C0"/>
+          <w:sz w:val="16"/>
+          <w:szCs w:val="16"/>
+        </w:rPr>
+        <w:t xml:space="preserve">      cleaned up script declaration and added proper reference to icons</w:t>
+      </w:r>
+    </w:p>
+    <w:p>
+      <w:pPr>
+        <w:rPr>
+          <w:color w:val="0070C0"/>
+          <w:sz w:val="16"/>
+          <w:szCs w:val="16"/>
+        </w:rPr>
+      </w:pPr>
+      <w:r>
+        <w:rPr>
+          <w:color w:val="0070C0"/>
+          <w:sz w:val="16"/>
+          <w:szCs w:val="16"/>
+        </w:rPr>
+        <w:t xml:space="preserve">      Fixed footer anchor to bottom and cleaned up bootstrap links</w:t>
+      </w:r>
+    </w:p>
+    <w:p>
+      <w:pPr>
+        <w:rPr>
+          <w:color w:val="0070C0"/>
+          <w:sz w:val="16"/>
+          <w:szCs w:val="16"/>
+        </w:rPr>
+      </w:pPr>
+      <w:r>
+        <w:rPr>
+          <w:color w:val="0070C0"/>
+          <w:sz w:val="16"/>
+          <w:szCs w:val="16"/>
+        </w:rPr>
+        <w:t xml:space="preserve">      Merge pull request #20 from santo1827/feature/</w:t>
+      </w:r>
+      <w:proofErr w:type="spellStart"/>
+      <w:r>
+        <w:rPr>
+          <w:color w:val="0070C0"/>
+          <w:sz w:val="16"/>
+          <w:szCs w:val="16"/>
+        </w:rPr>
+        <w:t>santo</w:t>
+      </w:r>
+      <w:proofErr w:type="spellEnd"/>
+    </w:p>
+    <w:p>
+      <w:pPr>
+        <w:rPr>
+          <w:color w:val="0070C0"/>
+          <w:sz w:val="16"/>
+          <w:szCs w:val="16"/>
+        </w:rPr>
+      </w:pPr>
+      <w:r>
+        <w:rPr>
+          <w:color w:val="0070C0"/>
+          <w:sz w:val="16"/>
+          <w:szCs w:val="16"/>
+        </w:rPr>
+        <w:t xml:space="preserve">      Added Page for the user's events that they have created</w:t>
+      </w:r>
+    </w:p>
+    <w:p>
+      <w:pPr>
+        <w:rPr>
+          <w:color w:val="0070C0"/>
+          <w:sz w:val="16"/>
+          <w:szCs w:val="16"/>
+        </w:rPr>
+      </w:pPr>
+      <w:r>
+        <w:rPr>
+          <w:color w:val="0070C0"/>
+          <w:sz w:val="16"/>
+          <w:szCs w:val="16"/>
+        </w:rPr>
+        <w:t xml:space="preserve">      Added commenting and started database query code</w:t>
+      </w:r>
+    </w:p>
+    <w:p>
+      <w:pPr>
+        <w:rPr>
+          <w:color w:val="0070C0"/>
+          <w:sz w:val="16"/>
+          <w:szCs w:val="16"/>
+        </w:rPr>
+      </w:pPr>
+      <w:r>
+        <w:rPr>
+          <w:color w:val="0070C0"/>
+          <w:sz w:val="16"/>
+          <w:szCs w:val="16"/>
+        </w:rPr>
+        <w:t xml:space="preserve">      Got database querying ready to go, </w:t>
+      </w:r>
+      <w:proofErr w:type="spellStart"/>
+      <w:r>
+        <w:rPr>
+          <w:color w:val="0070C0"/>
+          <w:sz w:val="16"/>
+          <w:szCs w:val="16"/>
+        </w:rPr>
+        <w:t>commiting</w:t>
+      </w:r>
+      <w:proofErr w:type="spellEnd"/>
+      <w:r>
+        <w:rPr>
+          <w:color w:val="0070C0"/>
+          <w:sz w:val="16"/>
+          <w:szCs w:val="16"/>
+        </w:rPr>
+        <w:t xml:space="preserve"> before working on FE rendering</w:t>
+      </w:r>
+    </w:p>
+    <w:p>
+      <w:pPr>
+        <w:rPr>
+          <w:color w:val="0070C0"/>
+          <w:sz w:val="16"/>
+          <w:szCs w:val="16"/>
+        </w:rPr>
+      </w:pPr>
+      <w:r>
+        <w:rPr>
+          <w:color w:val="0070C0"/>
+          <w:sz w:val="16"/>
+          <w:szCs w:val="16"/>
+        </w:rPr>
+        <w:t xml:space="preserve">      UI rendering from database to My Events page</w:t>
+      </w:r>
+    </w:p>
+    <w:p>
+      <w:pPr>
+        <w:rPr>
+          <w:color w:val="0070C0"/>
+          <w:sz w:val="16"/>
+          <w:szCs w:val="16"/>
+        </w:rPr>
+      </w:pPr>
+      <w:r>
+        <w:rPr>
+          <w:color w:val="0070C0"/>
+          <w:sz w:val="16"/>
+          <w:szCs w:val="16"/>
+        </w:rPr>
+        <w:t xml:space="preserve">      Rendering Events to index.html TODO: fix image rendering</w:t>
+      </w:r>
+    </w:p>
+    <w:p>
+      <w:pPr>
+        <w:rPr>
+          <w:color w:val="0070C0"/>
+          <w:sz w:val="16"/>
+          <w:szCs w:val="16"/>
+        </w:rPr>
+      </w:pPr>
+      <w:r>
+        <w:rPr>
+          <w:color w:val="0070C0"/>
+          <w:sz w:val="16"/>
+          <w:szCs w:val="16"/>
+        </w:rPr>
+        <w:t xml:space="preserve">      Deleted duplicate description attribute</w:t>
+      </w:r>
+    </w:p>
+    <w:p>
+      <w:pPr>
+        <w:rPr>
+          <w:color w:val="0070C0"/>
+          <w:sz w:val="16"/>
+          <w:szCs w:val="16"/>
+        </w:rPr>
+      </w:pPr>
+      <w:r>
+        <w:rPr>
+          <w:color w:val="0070C0"/>
+          <w:sz w:val="16"/>
+          <w:szCs w:val="16"/>
+        </w:rPr>
+        <w:t xml:space="preserve">      </w:t>
+      </w:r>
+      <w:proofErr w:type="spellStart"/>
+      <w:r>
+        <w:rPr>
+          <w:color w:val="0070C0"/>
+          <w:sz w:val="16"/>
+          <w:szCs w:val="16"/>
+        </w:rPr>
+        <w:t>Stoped</w:t>
+      </w:r>
+      <w:proofErr w:type="spellEnd"/>
+      <w:r>
+        <w:rPr>
+          <w:color w:val="0070C0"/>
+          <w:sz w:val="16"/>
+          <w:szCs w:val="16"/>
+        </w:rPr>
+        <w:t xml:space="preserve"> tracking DB Changes locally</w:t>
+      </w:r>
+    </w:p>
+    <w:p>
+      <w:pPr>
+        <w:rPr>
+          <w:color w:val="0070C0"/>
+          <w:sz w:val="16"/>
+          <w:szCs w:val="16"/>
+        </w:rPr>
+      </w:pPr>
+      <w:r>
+        <w:rPr>
+          <w:color w:val="0070C0"/>
+          <w:sz w:val="16"/>
+          <w:szCs w:val="16"/>
+        </w:rPr>
+        <w:t xml:space="preserve">      Fixed Image rendering and fixed the save command causing weird behaviour</w:t>
+      </w:r>
+    </w:p>
+    <w:p>
+      <w:pPr>
+        <w:rPr>
+          <w:color w:val="0070C0"/>
+          <w:sz w:val="16"/>
+          <w:szCs w:val="16"/>
+        </w:rPr>
+      </w:pPr>
+      <w:r>
+        <w:rPr>
+          <w:color w:val="0070C0"/>
+          <w:sz w:val="16"/>
+          <w:szCs w:val="16"/>
+        </w:rPr>
+        <w:t xml:space="preserve">      Remove static cards and keep only dynamic card generation</w:t>
+      </w:r>
+    </w:p>
+    <w:p>
+      <w:pPr>
+        <w:rPr>
+          <w:color w:val="0070C0"/>
+          <w:sz w:val="16"/>
+          <w:szCs w:val="16"/>
+        </w:rPr>
+      </w:pPr>
+      <w:r>
+        <w:rPr>
+          <w:color w:val="0070C0"/>
+          <w:sz w:val="16"/>
+          <w:szCs w:val="16"/>
+        </w:rPr>
+        <w:t xml:space="preserve">      Merge pull request #30 from santo1827/feature/</w:t>
+      </w:r>
+      <w:proofErr w:type="spellStart"/>
+      <w:r>
+        <w:rPr>
+          <w:color w:val="0070C0"/>
+          <w:sz w:val="16"/>
+          <w:szCs w:val="16"/>
+        </w:rPr>
+        <w:t>dbbrowse</w:t>
+      </w:r>
+      <w:proofErr w:type="spellEnd"/>
+    </w:p>
+    <w:p>
+      <w:pPr>
+        <w:rPr>
+          <w:color w:val="0070C0"/>
+          <w:sz w:val="16"/>
+          <w:szCs w:val="16"/>
+        </w:rPr>
+      </w:pPr>
+      <w:r>
+        <w:rPr>
+          <w:color w:val="0070C0"/>
+          <w:sz w:val="16"/>
+          <w:szCs w:val="16"/>
+        </w:rPr>
+        <w:t xml:space="preserve">      fixed the image viewing in content cards</w:t>
+      </w:r>
+    </w:p>
+    <w:p>
+      <w:pPr>
+        <w:rPr>
+          <w:color w:val="0070C0"/>
+          <w:sz w:val="16"/>
+          <w:szCs w:val="16"/>
+        </w:rPr>
+      </w:pPr>
+      <w:r>
+        <w:rPr>
+          <w:color w:val="0070C0"/>
+          <w:sz w:val="16"/>
+          <w:szCs w:val="16"/>
+        </w:rPr>
+        <w:t xml:space="preserve">      Merge pull request #31 from santo1827/feature/</w:t>
+      </w:r>
+      <w:proofErr w:type="spellStart"/>
+      <w:r>
+        <w:rPr>
+          <w:color w:val="0070C0"/>
+          <w:sz w:val="16"/>
+          <w:szCs w:val="16"/>
+        </w:rPr>
+        <w:t>dbbrowse</w:t>
+      </w:r>
+      <w:proofErr w:type="spellEnd"/>
+    </w:p>
+    <w:p>
+      <w:pPr>
+        <w:rPr>
+          <w:color w:val="0070C0"/>
+        </w:rPr>
+      </w:pPr>
+    </w:p>
+    <w:p>
+      <w:pPr>
+        <w:rPr>
+          <w:color w:val="0070C0"/>
+        </w:rPr>
+      </w:pPr>
+    </w:p>
+    <w:p>
+      <w:pPr>
         <w:pBdr>
           <w:top w:val="nil"/>
           <w:left w:val="nil"/>
@@ -3068,77 +3969,7 @@
           <w:szCs w:val="32"/>
         </w:rPr>
       </w:pPr>
-    </w:p>
-    <w:p>
-      <w:pPr>
-        <w:rPr>
-          <w:color w:val="0070C0"/>
-        </w:rPr>
-      </w:pPr>
-      <w:r>
-        <w:rPr>
-          <w:color w:val="0070C0"/>
-        </w:rPr>
-        <w:t xml:space="preserve">Paste git </w:t>
-      </w:r>
-      <w:proofErr w:type="spellStart"/>
-      <w:r>
-        <w:rPr>
-          <w:color w:val="0070C0"/>
-        </w:rPr>
-        <w:t>shortlog</w:t>
-      </w:r>
-      <w:proofErr w:type="spellEnd"/>
-      <w:r>
-        <w:rPr>
-          <w:color w:val="0070C0"/>
-        </w:rPr>
-        <w:t xml:space="preserve"> output here. </w:t>
-      </w:r>
-      <w:r>
-        <w:rPr>
-          <w:color w:val="0070C0"/>
-        </w:rPr>
-        <w:t xml:space="preserve">The git </w:t>
-      </w:r>
-      <w:proofErr w:type="spellStart"/>
-      <w:r>
-        <w:rPr>
-          <w:color w:val="0070C0"/>
-        </w:rPr>
-        <w:t>shortlog</w:t>
-      </w:r>
-      <w:proofErr w:type="spellEnd"/>
-      <w:r>
-        <w:rPr>
-          <w:color w:val="0070C0"/>
-        </w:rPr>
-        <w:t xml:space="preserve"> command provides a summarised view of the git log output, useful for release announcements and reporting. It groups commits by author and displays the first line of each commit message, offering a quick overview of contributors' work. This will help the marker confirm who has worked on what.</w:t>
-      </w:r>
-    </w:p>
-    <w:p>
-      <w:pPr>
-        <w:rPr>
-          <w:color w:val="0070C0"/>
-        </w:rPr>
-      </w:pPr>
-    </w:p>
-    <w:p>
-      <w:pPr>
-        <w:rPr>
-          <w:color w:val="0070C0"/>
-        </w:rPr>
-      </w:pPr>
-    </w:p>
-    <w:p>
-      <w:pPr>
-        <w:pBdr>
-          <w:top w:val="nil"/>
-          <w:left w:val="nil"/>
-          <w:bottom w:val="nil"/>
-          <w:right w:val="nil"/>
-          <w:between w:val="nil"/>
-        </w:pBdr>
+      <w:r>
         <w:rPr>
           <w:rStyle w:val="Strong"/>
           <w:rFonts w:ascii="Segoe UI" w:eastAsiaTheme="majorEastAsia" w:hAnsi="Segoe UI" w:cs="Segoe UI"/>
@@ -3148,7 +3979,8 @@
           <w:sz w:val="32"/>
           <w:szCs w:val="32"/>
         </w:rPr>
-      </w:pPr>
+        <w:t xml:space="preserve">Section </w:t>
+      </w:r>
       <w:r>
         <w:rPr>
           <w:rStyle w:val="Strong"/>
@@ -3159,7 +3991,7 @@
           <w:sz w:val="32"/>
           <w:szCs w:val="32"/>
         </w:rPr>
-        <w:t xml:space="preserve">Section </w:t>
+        <w:t>4</w:t>
       </w:r>
       <w:r>
         <w:rPr>
@@ -3171,7 +4003,7 @@
           <w:sz w:val="32"/>
           <w:szCs w:val="32"/>
         </w:rPr>
-        <w:t>4</w:t>
+        <w:t xml:space="preserve">: </w:t>
       </w:r>
       <w:r>
         <w:rPr>
@@ -3183,7 +4015,7 @@
           <w:sz w:val="32"/>
           <w:szCs w:val="32"/>
         </w:rPr>
-        <w:t xml:space="preserve">: </w:t>
+        <w:t>Team u</w:t>
       </w:r>
       <w:r>
         <w:rPr>
@@ -3195,9 +4027,18 @@
           <w:sz w:val="32"/>
           <w:szCs w:val="32"/>
         </w:rPr>
-        <w:t>Team u</w:t>
-      </w:r>
-      <w:r>
+        <w:t>se of AI statement</w:t>
+      </w:r>
+    </w:p>
+    <w:p>
+      <w:pPr>
+        <w:rPr>
+          <w:lang w:val="en-US"/>
+        </w:rPr>
+      </w:pPr>
+    </w:p>
+    <w:p>
+      <w:pPr>
         <w:rPr>
           <w:rStyle w:val="Strong"/>
           <w:rFonts w:ascii="Segoe UI" w:eastAsiaTheme="majorEastAsia" w:hAnsi="Segoe UI" w:cs="Segoe UI"/>
@@ -3207,278 +4048,25 @@
           <w:sz w:val="32"/>
           <w:szCs w:val="32"/>
         </w:rPr>
-        <w:t>se of AI statement</w:t>
-      </w:r>
-    </w:p>
-    <w:p>
-      <w:pPr>
-        <w:rPr>
-          <w:rStyle w:val="Strong"/>
-          <w:rFonts w:ascii="Segoe UI" w:eastAsiaTheme="majorEastAsia" w:hAnsi="Segoe UI" w:cs="Segoe UI"/>
-          <w:b w:val="0"/>
-          <w:bCs w:val="0"/>
-          <w:color w:val="404040"/>
-          <w:sz w:val="32"/>
-          <w:szCs w:val="32"/>
-        </w:rPr>
-      </w:pPr>
-    </w:p>
-    <w:p>
-      <w:pPr>
-        <w:rPr>
-          <w:color w:val="156082" w:themeColor="accent1"/>
+      </w:pPr>
+      <w:r>
+        <w:rPr>
           <w:lang w:val="en-US"/>
         </w:rPr>
-      </w:pPr>
-      <w:r>
-        <w:rPr>
-          <w:color w:val="156082" w:themeColor="accent1"/>
+        <w:t>As a team, we report that all members have stated they did not use AI in completing the assignment.</w:t>
+      </w:r>
+      <w:r>
+        <w:rPr>
           <w:lang w:val="en-US"/>
         </w:rPr>
-        <w:t xml:space="preserve">Instructions: </w:t>
-      </w:r>
-    </w:p>
-    <w:p>
-      <w:pPr>
-        <w:pStyle w:val="ListParagraph"/>
-        <w:numPr>
-          <w:ilvl w:val="0"/>
-          <w:numId w:val="5"/>
-        </w:numPr>
-        <w:spacing w:after="160" w:line="278" w:lineRule="auto"/>
-        <w:rPr>
-          <w:color w:val="156082" w:themeColor="accent1"/>
+        <w:br/>
+      </w:r>
+      <w:r>
+        <w:rPr>
           <w:lang w:val="en-US"/>
         </w:rPr>
-      </w:pPr>
-      <w:r>
-        <w:rPr>
-          <w:b/>
-          <w:bCs/>
-          <w:color w:val="156082" w:themeColor="accent1"/>
-          <w:lang w:val="en-US"/>
-        </w:rPr>
-        <w:t>We</w:t>
-      </w:r>
-      <w:r>
-        <w:rPr>
-          <w:b/>
-          <w:bCs/>
-          <w:color w:val="156082" w:themeColor="accent1"/>
-          <w:lang w:val="en-US"/>
-        </w:rPr>
-        <w:t xml:space="preserve"> did not use AI</w:t>
-      </w:r>
-      <w:r>
-        <w:rPr>
-          <w:color w:val="156082" w:themeColor="accent1"/>
-          <w:lang w:val="en-US"/>
-        </w:rPr>
-        <w:t>. Include part A</w:t>
-      </w:r>
-      <w:r>
-        <w:rPr>
-          <w:color w:val="156082" w:themeColor="accent1"/>
-          <w:lang w:val="en-US"/>
-        </w:rPr>
-        <w:t>.</w:t>
-      </w:r>
-      <w:r>
-        <w:rPr>
-          <w:color w:val="156082" w:themeColor="accent1"/>
-          <w:lang w:val="en-US"/>
-        </w:rPr>
-        <w:t xml:space="preserve"> Delete part B.</w:t>
-      </w:r>
-    </w:p>
-    <w:p>
-      <w:pPr>
-        <w:pStyle w:val="ListParagraph"/>
-        <w:numPr>
-          <w:ilvl w:val="0"/>
-          <w:numId w:val="5"/>
-        </w:numPr>
-        <w:spacing w:after="160" w:line="278" w:lineRule="auto"/>
-        <w:rPr>
-          <w:color w:val="156082" w:themeColor="accent1"/>
-          <w:lang w:val="en-US"/>
-        </w:rPr>
-      </w:pPr>
-      <w:r>
-        <w:rPr>
-          <w:b/>
-          <w:bCs/>
-          <w:color w:val="156082" w:themeColor="accent1"/>
-          <w:lang w:val="en-US"/>
-        </w:rPr>
-        <w:t>We (one or more team members)</w:t>
-      </w:r>
-      <w:r>
-        <w:rPr>
-          <w:b/>
-          <w:bCs/>
-          <w:color w:val="156082" w:themeColor="accent1"/>
-          <w:lang w:val="en-US"/>
-        </w:rPr>
-        <w:t xml:space="preserve"> used AI in an authorized way</w:t>
-      </w:r>
-      <w:r>
-        <w:rPr>
-          <w:color w:val="156082" w:themeColor="accent1"/>
-          <w:lang w:val="en-US"/>
-        </w:rPr>
-        <w:t xml:space="preserve"> (as described in the assignment brief)</w:t>
-      </w:r>
-      <w:r>
-        <w:rPr>
-          <w:color w:val="156082" w:themeColor="accent1"/>
-          <w:lang w:val="en-US"/>
-        </w:rPr>
-        <w:t>. Complete part B</w:t>
-      </w:r>
-      <w:r>
-        <w:rPr>
-          <w:color w:val="156082" w:themeColor="accent1"/>
-          <w:lang w:val="en-US"/>
-        </w:rPr>
-        <w:t>.</w:t>
-      </w:r>
-      <w:r>
-        <w:rPr>
-          <w:color w:val="156082" w:themeColor="accent1"/>
-          <w:lang w:val="en-US"/>
-        </w:rPr>
-        <w:t xml:space="preserve"> Delete part A.</w:t>
-      </w:r>
-    </w:p>
-    <w:p>
-      <w:pPr>
-        <w:pStyle w:val="ListParagraph"/>
-        <w:numPr>
-          <w:ilvl w:val="0"/>
-          <w:numId w:val="5"/>
-        </w:numPr>
-        <w:spacing w:after="160" w:line="278" w:lineRule="auto"/>
-        <w:rPr>
-          <w:color w:val="156082" w:themeColor="accent1"/>
-          <w:lang w:val="en-US"/>
-        </w:rPr>
-      </w:pPr>
-      <w:r>
-        <w:rPr>
-          <w:b/>
-          <w:bCs/>
-          <w:color w:val="156082" w:themeColor="accent1"/>
-          <w:lang w:val="en-US"/>
-        </w:rPr>
-        <w:t>We are not sure</w:t>
-      </w:r>
-      <w:r>
-        <w:rPr>
-          <w:color w:val="156082" w:themeColor="accent1"/>
-          <w:lang w:val="en-US"/>
-        </w:rPr>
-        <w:t xml:space="preserve">… please </w:t>
-      </w:r>
-      <w:r>
-        <w:rPr>
-          <w:color w:val="156082" w:themeColor="accent1"/>
-          <w:lang w:val="en-US"/>
-        </w:rPr>
-        <w:t>speak to your tutor before submitting the assignment</w:t>
-      </w:r>
-      <w:r>
-        <w:rPr>
-          <w:color w:val="156082" w:themeColor="accent1"/>
-          <w:lang w:val="en-US"/>
-        </w:rPr>
-        <w:t>.</w:t>
-      </w:r>
-    </w:p>
-    <w:p>
-      <w:pPr>
-        <w:rPr>
-          <w:b/>
-          <w:bCs/>
-          <w:lang w:val="en-US"/>
-        </w:rPr>
-      </w:pPr>
-    </w:p>
-    <w:p>
-      <w:pPr>
-        <w:rPr>
-          <w:color w:val="156082" w:themeColor="accent1"/>
-          <w:lang w:val="en-US"/>
-        </w:rPr>
-      </w:pPr>
-      <w:r>
-        <w:rPr>
-          <w:b/>
-          <w:bCs/>
-          <w:lang w:val="en-US"/>
-        </w:rPr>
-        <w:t>Part</w:t>
-      </w:r>
-      <w:r>
-        <w:rPr>
-          <w:b/>
-          <w:bCs/>
-          <w:lang w:val="en-US"/>
-        </w:rPr>
-        <w:t xml:space="preserve"> A</w:t>
-      </w:r>
-      <w:r>
-        <w:rPr>
-          <w:lang w:val="en-US"/>
-        </w:rPr>
-        <w:t xml:space="preserve">: </w:t>
-      </w:r>
-      <w:r>
-        <w:rPr>
-          <w:color w:val="156082" w:themeColor="accent1"/>
-          <w:lang w:val="en-US"/>
-        </w:rPr>
-        <w:t xml:space="preserve">(delete </w:t>
-      </w:r>
-      <w:r>
-        <w:rPr>
-          <w:color w:val="156082" w:themeColor="accent1"/>
-          <w:lang w:val="en-US"/>
-        </w:rPr>
-        <w:t>part</w:t>
-      </w:r>
-      <w:r>
-        <w:rPr>
-          <w:color w:val="156082" w:themeColor="accent1"/>
-          <w:lang w:val="en-US"/>
-        </w:rPr>
-        <w:t xml:space="preserve"> if not used)</w:t>
-      </w:r>
-    </w:p>
-    <w:p>
-      <w:pPr>
-        <w:rPr>
-          <w:lang w:val="en-US"/>
-        </w:rPr>
-      </w:pPr>
-    </w:p>
-    <w:p>
-      <w:pPr>
-        <w:rPr>
-          <w:rStyle w:val="Strong"/>
-          <w:rFonts w:ascii="Segoe UI" w:eastAsiaTheme="majorEastAsia" w:hAnsi="Segoe UI" w:cs="Segoe UI"/>
-          <w:b w:val="0"/>
-          <w:bCs w:val="0"/>
-          <w:color w:val="404040"/>
-          <w:sz w:val="32"/>
-          <w:szCs w:val="32"/>
-        </w:rPr>
-      </w:pPr>
-      <w:r>
-        <w:rPr>
-          <w:lang w:val="en-US"/>
-        </w:rPr>
-        <w:t>As a team, we report that all members have stated they did not use AI in completing the assignment.</w:t>
+        <w:br/>
+        <w:t xml:space="preserve">I Tiernan Martin confirm that to my knowledge no AI was used in this assignment. </w:t>
       </w:r>
     </w:p>
     <w:p/>
@@ -3487,498 +4075,17 @@
     <w:p>
       <w:pPr>
         <w:rPr>
-          <w:lang w:val="en-US"/>
+          <w:color w:val="0070C0"/>
         </w:rPr>
       </w:pPr>
       <w:r>
         <w:rPr>
           <w:b/>
           <w:bCs/>
-          <w:lang w:val="en-US"/>
-        </w:rPr>
-        <w:t>Part</w:t>
-      </w:r>
-      <w:r>
-        <w:rPr>
-          <w:b/>
-          <w:bCs/>
-          <w:lang w:val="en-US"/>
-        </w:rPr>
-        <w:t xml:space="preserve"> B</w:t>
-      </w:r>
-      <w:r>
-        <w:rPr>
-          <w:lang w:val="en-US"/>
-        </w:rPr>
-        <w:t xml:space="preserve">: </w:t>
-      </w:r>
-      <w:r>
-        <w:rPr>
-          <w:color w:val="156082" w:themeColor="accent1"/>
-          <w:lang w:val="en-US"/>
-        </w:rPr>
-        <w:t xml:space="preserve">(delete </w:t>
-      </w:r>
-      <w:r>
-        <w:rPr>
-          <w:color w:val="156082" w:themeColor="accent1"/>
-          <w:lang w:val="en-US"/>
-        </w:rPr>
-        <w:t>part</w:t>
-      </w:r>
-      <w:r>
-        <w:rPr>
-          <w:color w:val="156082" w:themeColor="accent1"/>
-          <w:lang w:val="en-US"/>
-        </w:rPr>
-        <w:t xml:space="preserve"> if not used)</w:t>
-      </w:r>
-    </w:p>
-    <w:p>
-      <w:pPr>
-        <w:rPr>
-          <w:lang w:val="en-US"/>
-        </w:rPr>
-      </w:pPr>
-    </w:p>
-    <w:p>
-      <w:pPr>
-        <w:rPr>
-          <w:lang w:val="en-US"/>
-        </w:rPr>
-      </w:pPr>
-      <w:r>
-        <w:rPr>
-          <w:lang w:val="en-US"/>
-        </w:rPr>
-        <w:t>As a team, we report that some members have stated they AI in the following authorized way.</w:t>
-      </w:r>
-    </w:p>
-    <w:p>
-      <w:pPr>
-        <w:rPr>
-          <w:lang w:val="en-US"/>
-        </w:rPr>
-      </w:pPr>
-    </w:p>
-    <w:p>
-      <w:pPr>
-        <w:rPr>
-          <w:lang w:val="en-US"/>
-        </w:rPr>
-      </w:pPr>
-      <w:r>
-        <w:rPr>
+          <w:color w:val="0070C0"/>
           <w:u w:val="single"/>
-          <w:lang w:val="en-US"/>
-        </w:rPr>
-        <w:t>Summary of AI use</w:t>
-      </w:r>
-      <w:r>
-        <w:rPr>
-          <w:lang w:val="en-US"/>
-        </w:rPr>
-        <w:t xml:space="preserve"> </w:t>
-      </w:r>
-    </w:p>
-    <w:p>
-      <w:pPr>
-        <w:rPr>
-          <w:lang w:val="en-US"/>
-        </w:rPr>
-      </w:pPr>
-      <w:r>
-        <w:rPr>
-          <w:lang w:val="en-US"/>
-        </w:rPr>
-        <w:t xml:space="preserve">(no word limit but </w:t>
-      </w:r>
-      <w:r>
-        <w:rPr>
-          <w:lang w:val="en-US"/>
-        </w:rPr>
-        <w:t xml:space="preserve">we </w:t>
-      </w:r>
-      <w:r>
-        <w:rPr>
-          <w:lang w:val="en-US"/>
-        </w:rPr>
-        <w:t xml:space="preserve">suggest 50-100 words describing </w:t>
-      </w:r>
-      <w:r>
-        <w:rPr>
-          <w:lang w:val="en-US"/>
-        </w:rPr>
-        <w:t xml:space="preserve">how </w:t>
-      </w:r>
-      <w:r>
-        <w:rPr>
-          <w:lang w:val="en-US"/>
-        </w:rPr>
-        <w:t>your team</w:t>
-      </w:r>
-      <w:r>
-        <w:rPr>
-          <w:lang w:val="en-US"/>
-        </w:rPr>
-        <w:t xml:space="preserve"> used AI</w:t>
-      </w:r>
-      <w:r>
-        <w:rPr>
-          <w:lang w:val="en-US"/>
-        </w:rPr>
-        <w:t>)</w:t>
-      </w:r>
-    </w:p>
-    <w:tbl>
-      <w:tblPr>
-        <w:tblStyle w:val="TableGrid"/>
-        <w:tblW w:w="0" w:type="auto"/>
-        <w:tblLook w:val="04A0" w:firstRow="1" w:lastRow="0" w:firstColumn="1" w:lastColumn="0" w:noHBand="0" w:noVBand="1"/>
-      </w:tblPr>
-      <w:tblGrid>
-        <w:gridCol w:w="9016"/>
-      </w:tblGrid>
-      <w:tr>
-        <w:tc>
-          <w:tcPr>
-            <w:tcW w:w="9016" w:type="dxa"/>
-          </w:tcPr>
-          <w:p>
-            <w:pPr>
-              <w:rPr>
-                <w:lang w:val="en-US"/>
-              </w:rPr>
-            </w:pPr>
-          </w:p>
-          <w:p>
-            <w:pPr>
-              <w:rPr>
-                <w:lang w:val="en-US"/>
-              </w:rPr>
-            </w:pPr>
-          </w:p>
-          <w:p>
-            <w:pPr>
-              <w:rPr>
-                <w:lang w:val="en-US"/>
-              </w:rPr>
-            </w:pPr>
-          </w:p>
-        </w:tc>
-      </w:tr>
-    </w:tbl>
-    <w:p>
-      <w:pPr>
-        <w:rPr>
-          <w:lang w:val="en-US"/>
-        </w:rPr>
-      </w:pPr>
-    </w:p>
-    <w:p>
-      <w:pPr>
-        <w:rPr>
-          <w:u w:val="single"/>
-          <w:lang w:val="en-US"/>
-        </w:rPr>
-      </w:pPr>
-      <w:r>
-        <w:rPr>
-          <w:u w:val="single"/>
-          <w:lang w:val="en-US"/>
-        </w:rPr>
-        <w:t>Key examples of AI use</w:t>
-      </w:r>
-    </w:p>
-    <w:p>
-      <w:pPr>
-        <w:rPr>
-          <w:lang w:val="en-US"/>
-        </w:rPr>
-      </w:pPr>
-      <w:r>
-        <w:rPr>
-          <w:lang w:val="en-US"/>
-        </w:rPr>
-        <w:t xml:space="preserve">Your marker needs to clearly understand how </w:t>
-      </w:r>
-      <w:r>
-        <w:rPr>
-          <w:lang w:val="en-US"/>
-        </w:rPr>
-        <w:t>your team</w:t>
-      </w:r>
-      <w:r>
-        <w:rPr>
-          <w:lang w:val="en-US"/>
-        </w:rPr>
-        <w:t xml:space="preserve"> used AI to improve your work. P</w:t>
-      </w:r>
-      <w:r>
-        <w:rPr>
-          <w:lang w:val="en-US"/>
-        </w:rPr>
-        <w:t xml:space="preserve">rovide representative </w:t>
-      </w:r>
-      <w:r>
-        <w:rPr>
-          <w:lang w:val="en-US"/>
-        </w:rPr>
-        <w:t>samples</w:t>
-      </w:r>
-      <w:r>
-        <w:rPr>
-          <w:lang w:val="en-US"/>
-        </w:rPr>
-        <w:t xml:space="preserve"> of how you used AI using the </w:t>
-      </w:r>
-      <w:r>
-        <w:rPr>
-          <w:lang w:val="en-US"/>
-        </w:rPr>
-        <w:t>requested format.</w:t>
-      </w:r>
-    </w:p>
-    <w:p>
-      <w:pPr>
-        <w:rPr>
-          <w:color w:val="156082" w:themeColor="accent1"/>
-          <w:lang w:val="en-US"/>
-        </w:rPr>
-      </w:pPr>
-      <w:r>
-        <w:rPr>
-          <w:color w:val="156082" w:themeColor="accent1"/>
-          <w:lang w:val="en-US"/>
-        </w:rPr>
-        <w:t>(Repeat for each example. There is no word limit for this declaration.</w:t>
-      </w:r>
-      <w:r>
-        <w:rPr>
-          <w:color w:val="156082" w:themeColor="accent1"/>
-          <w:lang w:val="en-US"/>
-        </w:rPr>
-        <w:t xml:space="preserve"> Please also include the separator line</w:t>
-      </w:r>
-      <w:r>
-        <w:rPr>
-          <w:color w:val="156082" w:themeColor="accent1"/>
-          <w:lang w:val="en-US"/>
-        </w:rPr>
-        <w:t>)</w:t>
-      </w:r>
-    </w:p>
-    <w:p>
-      <w:pPr>
-        <w:rPr>
-          <w:color w:val="156082" w:themeColor="accent1"/>
-          <w:lang w:val="en-US"/>
-        </w:rPr>
-      </w:pPr>
-      <w:r>
-        <w:rPr>
-          <w:color w:val="156082" w:themeColor="accent1"/>
-          <w:lang w:val="en-US"/>
-        </w:rPr>
-        <w:t>{</w:t>
-      </w:r>
-    </w:p>
-    <w:p>
-      <w:pPr>
-        <w:pStyle w:val="ListParagraph"/>
-        <w:numPr>
-          <w:ilvl w:val="0"/>
-          <w:numId w:val="6"/>
-        </w:numPr>
-        <w:spacing w:after="160" w:line="278" w:lineRule="auto"/>
-        <w:rPr>
-          <w:lang w:val="en-US"/>
-        </w:rPr>
-      </w:pPr>
-      <w:r>
-        <w:rPr>
-          <w:b/>
-          <w:bCs/>
-          <w:lang w:val="en-US"/>
-        </w:rPr>
-        <w:t>Paste the prompt</w:t>
-      </w:r>
-      <w:r>
-        <w:rPr>
-          <w:lang w:val="en-US"/>
-        </w:rPr>
-        <w:t xml:space="preserve"> you gave to the AI (e.g. "Improve the grammar and spelling in the attached document without changing any of the meaning").</w:t>
-      </w:r>
-    </w:p>
-    <w:p>
-      <w:pPr>
-        <w:pStyle w:val="ListParagraph"/>
-        <w:numPr>
-          <w:ilvl w:val="0"/>
-          <w:numId w:val="6"/>
-        </w:numPr>
-        <w:spacing w:after="160" w:line="278" w:lineRule="auto"/>
-        <w:rPr>
-          <w:lang w:val="en-US"/>
-        </w:rPr>
-      </w:pPr>
-      <w:r>
-        <w:rPr>
-          <w:b/>
-          <w:bCs/>
-          <w:lang w:val="en-US"/>
-        </w:rPr>
-        <w:t xml:space="preserve">Paste any input </w:t>
-      </w:r>
-      <w:r>
-        <w:rPr>
-          <w:lang w:val="en-US"/>
-        </w:rPr>
-        <w:t>or upload that accompanied the prompt (e.g. the document, text, or context you provided).</w:t>
-      </w:r>
-    </w:p>
-    <w:p>
-      <w:pPr>
-        <w:pStyle w:val="ListParagraph"/>
-        <w:numPr>
-          <w:ilvl w:val="0"/>
-          <w:numId w:val="6"/>
-        </w:numPr>
-        <w:spacing w:after="160" w:line="278" w:lineRule="auto"/>
-        <w:rPr>
-          <w:lang w:val="en-US"/>
-        </w:rPr>
-      </w:pPr>
-      <w:r>
-        <w:rPr>
-          <w:b/>
-          <w:bCs/>
-          <w:lang w:val="en-US"/>
-        </w:rPr>
-        <w:t>Paste the output</w:t>
-      </w:r>
-      <w:r>
-        <w:rPr>
-          <w:lang w:val="en-US"/>
-        </w:rPr>
-        <w:t xml:space="preserve"> generated by the AI.</w:t>
-      </w:r>
-    </w:p>
-    <w:p>
-      <w:pPr>
-        <w:rPr>
-          <w:b/>
-          <w:bCs/>
-          <w:lang w:val="en-US"/>
-        </w:rPr>
-      </w:pPr>
-    </w:p>
-    <w:p>
-      <w:pPr>
-        <w:rPr>
-          <w:lang w:val="en-US"/>
-        </w:rPr>
-      </w:pPr>
-      <w:r>
-        <w:rPr>
-          <w:lang w:val="en-US"/>
-        </w:rPr>
-        <w:t>========================= NEXT SAMPLE OF AI USE ====================</w:t>
-      </w:r>
-    </w:p>
-    <w:p>
-      <w:pPr>
-        <w:rPr>
-          <w:lang w:val="en-US"/>
-        </w:rPr>
-      </w:pPr>
-      <w:r>
-        <w:rPr>
-          <w:color w:val="156082" w:themeColor="accent1"/>
-          <w:lang w:val="en-US"/>
-        </w:rPr>
-        <w:t>}</w:t>
-      </w:r>
-    </w:p>
-    <w:p/>
-    <w:p/>
-    <w:p>
-      <w:pPr>
-        <w:pBdr>
-          <w:bottom w:val="single" w:sz="6" w:space="1" w:color="auto"/>
-        </w:pBdr>
-      </w:pPr>
-    </w:p>
-    <w:p>
-      <w:pPr>
-        <w:pBdr>
-          <w:bottom w:val="single" w:sz="6" w:space="1" w:color="auto"/>
-        </w:pBdr>
-      </w:pPr>
-    </w:p>
-    <w:p>
-      <w:pPr>
-        <w:pBdr>
-          <w:bottom w:val="single" w:sz="6" w:space="1" w:color="auto"/>
-        </w:pBdr>
-      </w:pPr>
-    </w:p>
-    <w:p>
-      <w:pPr>
-        <w:pBdr>
-          <w:bottom w:val="single" w:sz="6" w:space="1" w:color="auto"/>
-        </w:pBdr>
-      </w:pPr>
-    </w:p>
-    <w:p>
-      <w:pPr>
-        <w:pBdr>
-          <w:bottom w:val="single" w:sz="6" w:space="1" w:color="auto"/>
-        </w:pBdr>
-      </w:pPr>
-    </w:p>
-    <w:p>
-      <w:pPr>
-        <w:pBdr>
-          <w:bottom w:val="single" w:sz="6" w:space="1" w:color="auto"/>
-        </w:pBdr>
-      </w:pPr>
-    </w:p>
-    <w:p>
-      <w:pPr>
-        <w:pBdr>
-          <w:bottom w:val="single" w:sz="6" w:space="1" w:color="auto"/>
-        </w:pBdr>
-      </w:pPr>
-    </w:p>
-    <w:p>
-      <w:pPr>
-        <w:pBdr>
-          <w:bottom w:val="single" w:sz="6" w:space="1" w:color="auto"/>
-        </w:pBdr>
-      </w:pPr>
-    </w:p>
-    <w:p>
-      <w:pPr>
-        <w:pBdr>
-          <w:bottom w:val="single" w:sz="6" w:space="1" w:color="auto"/>
-        </w:pBdr>
-      </w:pPr>
-    </w:p>
-    <w:p/>
-    <w:p>
-      <w:pPr>
-        <w:rPr>
-          <w:color w:val="0070C0"/>
-        </w:rPr>
-      </w:pPr>
-      <w:r>
-        <w:rPr>
-          <w:b/>
-          <w:bCs/>
-          <w:color w:val="0070C0"/>
-          <w:u w:val="single"/>
-        </w:rPr>
+        </w:rPr>
+        <w:lastRenderedPageBreak/>
         <w:t>Document version history</w:t>
       </w:r>
       <w:r>
@@ -4082,25 +4189,19 @@
               <w:rPr>
                 <w:color w:val="0070C0"/>
               </w:rPr>
-              <w:t>2</w:t>
+              <w:t>01</w:t>
             </w:r>
             <w:r>
               <w:rPr>
                 <w:color w:val="0070C0"/>
               </w:rPr>
-              <w:t>5</w:t>
+              <w:t>/</w:t>
             </w:r>
             <w:r>
               <w:rPr>
                 <w:color w:val="0070C0"/>
               </w:rPr>
-              <w:t>/0</w:t>
-            </w:r>
-            <w:r>
-              <w:rPr>
-                <w:color w:val="0070C0"/>
-              </w:rPr>
-              <w:t>8</w:t>
+              <w:t>11</w:t>
             </w:r>
             <w:r>
               <w:rPr>
@@ -4142,7 +4243,7 @@
               <w:rPr>
                 <w:color w:val="0070C0"/>
               </w:rPr>
-              <w:t>First version</w:t>
+              <w:t>Tiernan populated most fields</w:t>
             </w:r>
           </w:p>
         </w:tc>

</xml_diff>

<commit_message>
Fill Out Declaration + Update Shortlog
</commit_message>
<xml_diff>
--- a/Assignment declaration v1-1.docx
+++ b/Assignment declaration v1-1.docx
@@ -1158,7 +1158,14 @@
                 <w:sz w:val="20"/>
                 <w:szCs w:val="20"/>
               </w:rPr>
-              <w:t>n123456</w:t>
+              <w:t>n1</w:t>
+            </w:r>
+            <w:r>
+              <w:rPr>
+                <w:sz w:val="20"/>
+                <w:szCs w:val="20"/>
+              </w:rPr>
+              <w:t>0171614</w:t>
             </w:r>
           </w:p>
         </w:tc>
@@ -1186,13 +1193,16 @@
                 <w:szCs w:val="20"/>
               </w:rPr>
             </w:pPr>
-            <w:r>
-              <w:rPr>
-                <w:sz w:val="20"/>
-                <w:szCs w:val="20"/>
-              </w:rPr>
-              <w:t>Person_name@qut.edu.au</w:t>
-            </w:r>
+            <w:hyperlink r:id="rId8" w:history="1">
+              <w:r>
+                <w:rPr>
+                  <w:rStyle w:val="Hyperlink"/>
+                  <w:sz w:val="20"/>
+                  <w:szCs w:val="20"/>
+                </w:rPr>
+                <w:t>N10171614@qut.edu.au</w:t>
+              </w:r>
+            </w:hyperlink>
           </w:p>
         </w:tc>
         <w:tc>
@@ -1220,6 +1230,13 @@
                 <w:szCs w:val="20"/>
               </w:rPr>
             </w:pPr>
+            <w:r>
+              <w:rPr>
+                <w:sz w:val="20"/>
+                <w:szCs w:val="20"/>
+              </w:rPr>
+              <w:t>5</w:t>
+            </w:r>
           </w:p>
         </w:tc>
       </w:tr>
@@ -1781,7 +1798,7 @@
               <w:rPr>
                 <w:color w:val="0070C0"/>
               </w:rPr>
-              <w:t>Full name of team member 2</w:t>
+              <w:t>Joshua Mitchell</w:t>
             </w:r>
           </w:p>
         </w:tc>
@@ -1799,7 +1816,7 @@
               <w:rPr>
                 <w:color w:val="0070C0"/>
               </w:rPr>
-              <w:t>(Contribution statement)</w:t>
+              <w:t>I contributed minorly to the project. I was not involved with the building or functionality of the platform. I added 404 and 500 errors, input form length validators, and dynamic datetime script for the event details page.</w:t>
             </w:r>
           </w:p>
         </w:tc>
@@ -2021,7 +2038,7 @@
           <w:sz w:val="16"/>
           <w:szCs w:val="16"/>
         </w:rPr>
-        <w:t>4tiernan (55):</w:t>
+        <w:t>4tiernan (56):</w:t>
       </w:r>
     </w:p>
     <w:p>
@@ -2796,6 +2813,7 @@
           <w:sz w:val="16"/>
           <w:szCs w:val="16"/>
         </w:rPr>
+        <w:lastRenderedPageBreak/>
         <w:t xml:space="preserve">      Event editing functionality implemented</w:t>
       </w:r>
     </w:p>
@@ -2847,7 +2865,6 @@
           <w:sz w:val="16"/>
           <w:szCs w:val="16"/>
         </w:rPr>
-        <w:lastRenderedPageBreak/>
         <w:t xml:space="preserve">      Fixed my events page event status display</w:t>
       </w:r>
     </w:p>
@@ -3134,6 +3151,23 @@
           <w:szCs w:val="16"/>
         </w:rPr>
       </w:pPr>
+      <w:r>
+        <w:rPr>
+          <w:color w:val="0070C0"/>
+          <w:sz w:val="16"/>
+          <w:szCs w:val="16"/>
+        </w:rPr>
+        <w:t xml:space="preserve">      final</w:t>
+      </w:r>
+    </w:p>
+    <w:p>
+      <w:pPr>
+        <w:rPr>
+          <w:color w:val="0070C0"/>
+          <w:sz w:val="16"/>
+          <w:szCs w:val="16"/>
+        </w:rPr>
+      </w:pPr>
     </w:p>
     <w:p>
       <w:pPr>
@@ -3342,7 +3376,24 @@
           <w:sz w:val="16"/>
           <w:szCs w:val="16"/>
         </w:rPr>
-        <w:t xml:space="preserve"> page with View, Edit, and Delete functionality (partial implementation </w:t>
+        <w:t xml:space="preserve"> page with View, Edit, and Delete functionality (partial implementation — pending account creation for full testing).</w:t>
+      </w:r>
+    </w:p>
+    <w:p>
+      <w:pPr>
+        <w:rPr>
+          <w:color w:val="0070C0"/>
+          <w:sz w:val="16"/>
+          <w:szCs w:val="16"/>
+        </w:rPr>
+      </w:pPr>
+      <w:r>
+        <w:rPr>
+          <w:color w:val="0070C0"/>
+          <w:sz w:val="16"/>
+          <w:szCs w:val="16"/>
+        </w:rPr>
+        <w:t xml:space="preserve">      </w:t>
       </w:r>
       <w:proofErr w:type="spellStart"/>
       <w:r>
@@ -3351,7 +3402,7 @@
           <w:sz w:val="16"/>
           <w:szCs w:val="16"/>
         </w:rPr>
-        <w:t>ÔÇö</w:t>
+        <w:t>MyEvents</w:t>
       </w:r>
       <w:proofErr w:type="spellEnd"/>
       <w:r>
@@ -3360,24 +3411,7 @@
           <w:sz w:val="16"/>
           <w:szCs w:val="16"/>
         </w:rPr>
-        <w:t xml:space="preserve"> pending account creation for full testing).</w:t>
-      </w:r>
-    </w:p>
-    <w:p>
-      <w:pPr>
-        <w:rPr>
-          <w:color w:val="0070C0"/>
-          <w:sz w:val="16"/>
-          <w:szCs w:val="16"/>
-        </w:rPr>
-      </w:pPr>
-      <w:r>
-        <w:rPr>
-          <w:color w:val="0070C0"/>
-          <w:sz w:val="16"/>
-          <w:szCs w:val="16"/>
-        </w:rPr>
-        <w:t xml:space="preserve">      </w:t>
+        <w:t xml:space="preserve"> and </w:t>
       </w:r>
       <w:proofErr w:type="spellStart"/>
       <w:r>
@@ -3386,7 +3420,7 @@
           <w:sz w:val="16"/>
           <w:szCs w:val="16"/>
         </w:rPr>
-        <w:t>MyEvents</w:t>
+        <w:t>MyBookinsHistory</w:t>
       </w:r>
       <w:proofErr w:type="spellEnd"/>
       <w:r>
@@ -3395,7 +3429,41 @@
           <w:sz w:val="16"/>
           <w:szCs w:val="16"/>
         </w:rPr>
-        <w:t xml:space="preserve"> and </w:t>
+        <w:t xml:space="preserve"> is only accessible and visible to logged in users</w:t>
+      </w:r>
+    </w:p>
+    <w:p>
+      <w:pPr>
+        <w:rPr>
+          <w:color w:val="0070C0"/>
+          <w:sz w:val="16"/>
+          <w:szCs w:val="16"/>
+        </w:rPr>
+      </w:pPr>
+      <w:r>
+        <w:rPr>
+          <w:color w:val="0070C0"/>
+          <w:sz w:val="16"/>
+          <w:szCs w:val="16"/>
+        </w:rPr>
+        <w:t xml:space="preserve">      added login</w:t>
+      </w:r>
+    </w:p>
+    <w:p>
+      <w:pPr>
+        <w:rPr>
+          <w:color w:val="0070C0"/>
+          <w:sz w:val="16"/>
+          <w:szCs w:val="16"/>
+        </w:rPr>
+      </w:pPr>
+      <w:r>
+        <w:rPr>
+          <w:color w:val="0070C0"/>
+          <w:sz w:val="16"/>
+          <w:szCs w:val="16"/>
+        </w:rPr>
+        <w:t xml:space="preserve">      changed time </w:t>
       </w:r>
       <w:proofErr w:type="spellStart"/>
       <w:r>
@@ -3404,7 +3472,7 @@
           <w:sz w:val="16"/>
           <w:szCs w:val="16"/>
         </w:rPr>
-        <w:t>MyBookinsHistory</w:t>
+        <w:t>formating</w:t>
       </w:r>
       <w:proofErr w:type="spellEnd"/>
       <w:r>
@@ -3413,41 +3481,118 @@
           <w:sz w:val="16"/>
           <w:szCs w:val="16"/>
         </w:rPr>
-        <w:t xml:space="preserve"> is only accessible and visible to logged in users</w:t>
-      </w:r>
-    </w:p>
-    <w:p>
-      <w:pPr>
-        <w:rPr>
-          <w:color w:val="0070C0"/>
-          <w:sz w:val="16"/>
-          <w:szCs w:val="16"/>
-        </w:rPr>
-      </w:pPr>
-      <w:r>
-        <w:rPr>
-          <w:color w:val="0070C0"/>
-          <w:sz w:val="16"/>
-          <w:szCs w:val="16"/>
-        </w:rPr>
-        <w:t xml:space="preserve">      added login</w:t>
-      </w:r>
-    </w:p>
-    <w:p>
-      <w:pPr>
-        <w:rPr>
-          <w:color w:val="0070C0"/>
-          <w:sz w:val="16"/>
-          <w:szCs w:val="16"/>
-        </w:rPr>
-      </w:pPr>
-      <w:r>
-        <w:rPr>
-          <w:color w:val="0070C0"/>
-          <w:sz w:val="16"/>
-          <w:szCs w:val="16"/>
-        </w:rPr>
-        <w:t xml:space="preserve">      changed time </w:t>
+        <w:t xml:space="preserve"> in cards</w:t>
+      </w:r>
+    </w:p>
+    <w:p>
+      <w:pPr>
+        <w:rPr>
+          <w:color w:val="0070C0"/>
+          <w:sz w:val="16"/>
+          <w:szCs w:val="16"/>
+        </w:rPr>
+      </w:pPr>
+    </w:p>
+    <w:p>
+      <w:pPr>
+        <w:rPr>
+          <w:color w:val="0070C0"/>
+          <w:sz w:val="16"/>
+          <w:szCs w:val="16"/>
+        </w:rPr>
+      </w:pPr>
+      <w:r>
+        <w:rPr>
+          <w:color w:val="0070C0"/>
+          <w:sz w:val="16"/>
+          <w:szCs w:val="16"/>
+        </w:rPr>
+        <w:t>joshmitchell456 (6):</w:t>
+      </w:r>
+    </w:p>
+    <w:p>
+      <w:pPr>
+        <w:rPr>
+          <w:color w:val="0070C0"/>
+          <w:sz w:val="16"/>
+          <w:szCs w:val="16"/>
+        </w:rPr>
+      </w:pPr>
+      <w:r>
+        <w:rPr>
+          <w:color w:val="0070C0"/>
+          <w:sz w:val="16"/>
+          <w:szCs w:val="16"/>
+        </w:rPr>
+        <w:t xml:space="preserve">      Update README.md</w:t>
+      </w:r>
+    </w:p>
+    <w:p>
+      <w:pPr>
+        <w:rPr>
+          <w:color w:val="0070C0"/>
+          <w:sz w:val="16"/>
+          <w:szCs w:val="16"/>
+        </w:rPr>
+      </w:pPr>
+      <w:r>
+        <w:rPr>
+          <w:color w:val="0070C0"/>
+          <w:sz w:val="16"/>
+          <w:szCs w:val="16"/>
+        </w:rPr>
+        <w:t xml:space="preserve">      Add custom error pages and handlers</w:t>
+      </w:r>
+    </w:p>
+    <w:p>
+      <w:pPr>
+        <w:rPr>
+          <w:color w:val="0070C0"/>
+          <w:sz w:val="16"/>
+          <w:szCs w:val="16"/>
+        </w:rPr>
+      </w:pPr>
+      <w:r>
+        <w:rPr>
+          <w:color w:val="0070C0"/>
+          <w:sz w:val="16"/>
+          <w:szCs w:val="16"/>
+        </w:rPr>
+        <w:t xml:space="preserve">      Add Event Creation Form Input Length Validators</w:t>
+      </w:r>
+    </w:p>
+    <w:p>
+      <w:pPr>
+        <w:rPr>
+          <w:color w:val="0070C0"/>
+          <w:sz w:val="16"/>
+          <w:szCs w:val="16"/>
+        </w:rPr>
+      </w:pPr>
+      <w:r>
+        <w:rPr>
+          <w:color w:val="0070C0"/>
+          <w:sz w:val="16"/>
+          <w:szCs w:val="16"/>
+        </w:rPr>
+        <w:t xml:space="preserve">      Merge pull request #66 from santo1827/issue/josh-19-form-validator-length</w:t>
+      </w:r>
+    </w:p>
+    <w:p>
+      <w:pPr>
+        <w:rPr>
+          <w:color w:val="0070C0"/>
+          <w:sz w:val="16"/>
+          <w:szCs w:val="16"/>
+        </w:rPr>
+      </w:pPr>
+      <w:r>
+        <w:rPr>
+          <w:color w:val="0070C0"/>
+          <w:sz w:val="16"/>
+          <w:szCs w:val="16"/>
+        </w:rPr>
+        <w:t xml:space="preserve">      Dynamic </w:t>
       </w:r>
       <w:proofErr w:type="spellStart"/>
       <w:r>
@@ -3456,7 +3601,7 @@
           <w:sz w:val="16"/>
           <w:szCs w:val="16"/>
         </w:rPr>
-        <w:t>formating</w:t>
+        <w:t>EventDetails</w:t>
       </w:r>
       <w:proofErr w:type="spellEnd"/>
       <w:r>
@@ -3465,67 +3610,34 @@
           <w:sz w:val="16"/>
           <w:szCs w:val="16"/>
         </w:rPr>
-        <w:t xml:space="preserve"> in cards</w:t>
-      </w:r>
-    </w:p>
-    <w:p>
-      <w:pPr>
-        <w:rPr>
-          <w:color w:val="0070C0"/>
-          <w:sz w:val="16"/>
-          <w:szCs w:val="16"/>
-        </w:rPr>
-      </w:pPr>
-    </w:p>
-    <w:p>
-      <w:pPr>
-        <w:rPr>
-          <w:color w:val="0070C0"/>
-          <w:sz w:val="16"/>
-          <w:szCs w:val="16"/>
-        </w:rPr>
-      </w:pPr>
-      <w:r>
-        <w:rPr>
-          <w:color w:val="0070C0"/>
-          <w:sz w:val="16"/>
-          <w:szCs w:val="16"/>
-        </w:rPr>
-        <w:t>joshmitchell456 (2):</w:t>
-      </w:r>
-    </w:p>
-    <w:p>
-      <w:pPr>
-        <w:rPr>
-          <w:color w:val="0070C0"/>
-          <w:sz w:val="16"/>
-          <w:szCs w:val="16"/>
-        </w:rPr>
-      </w:pPr>
-      <w:r>
-        <w:rPr>
-          <w:color w:val="0070C0"/>
-          <w:sz w:val="16"/>
-          <w:szCs w:val="16"/>
-        </w:rPr>
-        <w:t xml:space="preserve">      Update README.md</w:t>
-      </w:r>
-    </w:p>
-    <w:p>
-      <w:pPr>
-        <w:rPr>
-          <w:color w:val="0070C0"/>
-          <w:sz w:val="16"/>
-          <w:szCs w:val="16"/>
-        </w:rPr>
-      </w:pPr>
-      <w:r>
-        <w:rPr>
-          <w:color w:val="0070C0"/>
-          <w:sz w:val="16"/>
-          <w:szCs w:val="16"/>
-        </w:rPr>
-        <w:t xml:space="preserve">      Add custom error pages and handlers</w:t>
+        <w:t xml:space="preserve"> </w:t>
+      </w:r>
+      <w:proofErr w:type="spellStart"/>
+      <w:r>
+        <w:rPr>
+          <w:color w:val="0070C0"/>
+          <w:sz w:val="16"/>
+          <w:szCs w:val="16"/>
+        </w:rPr>
+        <w:t>DateTime</w:t>
+      </w:r>
+      <w:proofErr w:type="spellEnd"/>
+    </w:p>
+    <w:p>
+      <w:pPr>
+        <w:rPr>
+          <w:color w:val="0070C0"/>
+          <w:sz w:val="16"/>
+          <w:szCs w:val="16"/>
+        </w:rPr>
+      </w:pPr>
+      <w:r>
+        <w:rPr>
+          <w:color w:val="0070C0"/>
+          <w:sz w:val="16"/>
+          <w:szCs w:val="16"/>
+        </w:rPr>
+        <w:t xml:space="preserve">      Merge pull request #67 from santo1827/feature/josh</w:t>
       </w:r>
     </w:p>
     <w:p>
@@ -3957,8 +4069,6 @@
       <w:pPr>
         <w:rPr>
           <w:color w:val="0070C0"/>
-          <w:sz w:val="16"/>
-          <w:szCs w:val="16"/>
         </w:rPr>
       </w:pPr>
       <w:r>
@@ -3979,13 +4089,6 @@
         <w:t>dbbrowse</w:t>
       </w:r>
       <w:proofErr w:type="spellEnd"/>
-    </w:p>
-    <w:p>
-      <w:pPr>
-        <w:rPr>
-          <w:color w:val="0070C0"/>
-        </w:rPr>
-      </w:pPr>
     </w:p>
     <w:p>
       <w:pPr>
@@ -4084,6 +4187,33 @@
     <w:p>
       <w:pPr>
         <w:rPr>
+          <w:lang w:val="en-US"/>
+        </w:rPr>
+      </w:pPr>
+      <w:r>
+        <w:rPr>
+          <w:lang w:val="en-US"/>
+        </w:rPr>
+        <w:t>As a team, we report that all members have stated they did not use AI in completing the assignment.</w:t>
+      </w:r>
+      <w:r>
+        <w:rPr>
+          <w:lang w:val="en-US"/>
+        </w:rPr>
+        <w:br/>
+      </w:r>
+      <w:r>
+        <w:rPr>
+          <w:lang w:val="en-US"/>
+        </w:rPr>
+        <w:lastRenderedPageBreak/>
+        <w:br/>
+        <w:t xml:space="preserve">I Tiernan Martin confirm that to my knowledge no AI was used in this assignment. </w:t>
+      </w:r>
+    </w:p>
+    <w:p>
+      <w:pPr>
+        <w:rPr>
           <w:rStyle w:val="Strong"/>
           <w:rFonts w:ascii="Segoe UI" w:eastAsiaTheme="majorEastAsia" w:hAnsi="Segoe UI" w:cs="Segoe UI"/>
           <w:b w:val="0"/>
@@ -4097,20 +4227,7 @@
         <w:rPr>
           <w:lang w:val="en-US"/>
         </w:rPr>
-        <w:t>As a team, we report that all members have stated they did not use AI in completing the assignment.</w:t>
-      </w:r>
-      <w:r>
-        <w:rPr>
-          <w:lang w:val="en-US"/>
-        </w:rPr>
-        <w:br/>
-      </w:r>
-      <w:r>
-        <w:rPr>
-          <w:lang w:val="en-US"/>
-        </w:rPr>
-        <w:br/>
-        <w:t xml:space="preserve">I Tiernan Martin confirm that to my knowledge no AI was used in this assignment. </w:t>
+        <w:t>I Joshua Mitchell confirm that to my knowledge no AI was used in this assessment.</w:t>
       </w:r>
     </w:p>
     <w:p/>
@@ -4287,6 +4404,62 @@
                 <w:color w:val="0070C0"/>
               </w:rPr>
               <w:t>Tiernan populated most fields</w:t>
+            </w:r>
+          </w:p>
+        </w:tc>
+      </w:tr>
+      <w:tr>
+        <w:tc>
+          <w:tcPr>
+            <w:tcW w:w="1149" w:type="dxa"/>
+          </w:tcPr>
+          <w:p>
+            <w:pPr>
+              <w:rPr>
+                <w:color w:val="0070C0"/>
+              </w:rPr>
+            </w:pPr>
+            <w:r>
+              <w:rPr>
+                <w:color w:val="0070C0"/>
+              </w:rPr>
+              <w:t>01/11/25</w:t>
+            </w:r>
+          </w:p>
+        </w:tc>
+        <w:tc>
+          <w:tcPr>
+            <w:tcW w:w="973" w:type="dxa"/>
+          </w:tcPr>
+          <w:p>
+            <w:pPr>
+              <w:rPr>
+                <w:color w:val="0070C0"/>
+              </w:rPr>
+            </w:pPr>
+            <w:r>
+              <w:rPr>
+                <w:color w:val="0070C0"/>
+              </w:rPr>
+              <w:t>V1.1</w:t>
+            </w:r>
+          </w:p>
+        </w:tc>
+        <w:tc>
+          <w:tcPr>
+            <w:tcW w:w="6894" w:type="dxa"/>
+          </w:tcPr>
+          <w:p>
+            <w:pPr>
+              <w:rPr>
+                <w:color w:val="0070C0"/>
+              </w:rPr>
+            </w:pPr>
+            <w:r>
+              <w:rPr>
+                <w:color w:val="0070C0"/>
+              </w:rPr>
+              <w:t>Joshua Filled out, updated shortlog</w:t>
             </w:r>
           </w:p>
         </w:tc>

</xml_diff>

<commit_message>
filled out assignment declaration - Nodir
</commit_message>
<xml_diff>
--- a/Assignment declaration v1-1.docx
+++ b/Assignment declaration v1-1.docx
@@ -999,6 +999,13 @@
               </w:rPr>
               <w:t>Nodir</w:t>
             </w:r>
+            <w:r>
+              <w:rPr>
+                <w:sz w:val="20"/>
+                <w:szCs w:val="20"/>
+              </w:rPr>
+              <w:t xml:space="preserve"> Uktamov</w:t>
+            </w:r>
           </w:p>
         </w:tc>
         <w:tc>
@@ -1030,7 +1037,7 @@
                 <w:sz w:val="20"/>
                 <w:szCs w:val="20"/>
               </w:rPr>
-              <w:t>n123456</w:t>
+              <w:t>n12050679</w:t>
             </w:r>
           </w:p>
         </w:tc>
@@ -1063,7 +1070,14 @@
                 <w:sz w:val="20"/>
                 <w:szCs w:val="20"/>
               </w:rPr>
-              <w:t>Person_name@qut.edu.au</w:t>
+              <w:t>n12050679</w:t>
+            </w:r>
+            <w:r>
+              <w:rPr>
+                <w:sz w:val="20"/>
+                <w:szCs w:val="20"/>
+              </w:rPr>
+              <w:t>@qut.edu.au</w:t>
             </w:r>
           </w:p>
         </w:tc>
@@ -1092,6 +1106,20 @@
                 <w:szCs w:val="20"/>
               </w:rPr>
             </w:pPr>
+            <w:r>
+              <w:rPr>
+                <w:sz w:val="20"/>
+                <w:szCs w:val="20"/>
+              </w:rPr>
+              <w:t>2</w:t>
+            </w:r>
+            <w:r>
+              <w:rPr>
+                <w:sz w:val="20"/>
+                <w:szCs w:val="20"/>
+              </w:rPr>
+              <w:t>4</w:t>
+            </w:r>
           </w:p>
         </w:tc>
       </w:tr>
@@ -1836,7 +1864,7 @@
               <w:rPr>
                 <w:color w:val="0070C0"/>
               </w:rPr>
-              <w:t>Full name of team member 3</w:t>
+              <w:t>Nodir Uktamov</w:t>
             </w:r>
           </w:p>
         </w:tc>
@@ -1854,7 +1882,20 @@
               <w:rPr>
                 <w:color w:val="0070C0"/>
               </w:rPr>
-              <w:t>(Contribution statement)</w:t>
+              <w:t>I primarily worked on the front end of the application. The base front-end design was adapted from my first assignment. I developed the Login and Sign-Up pages, implemented dynamic rendering of web elements depending on whether a user is signed in or not, and enhanced the Create Event page to ensure all buttons functioned as intended. Additionally, I added unique IDs to all forms and buttons to improve accessibility.</w:t>
+            </w:r>
+            <w:r>
+              <w:rPr>
+                <w:color w:val="0070C0"/>
+              </w:rPr>
+              <w:br/>
+              <w:t>On the back end, I enhanced the Created Events page by implementing View, Edit, and Delete functionalities</w:t>
+            </w:r>
+            <w:r>
+              <w:rPr>
+                <w:color w:val="0070C0"/>
+              </w:rPr>
+              <w:t>.</w:t>
             </w:r>
           </w:p>
         </w:tc>
@@ -2589,6 +2630,7 @@
           <w:sz w:val="16"/>
           <w:szCs w:val="16"/>
         </w:rPr>
+        <w:lastRenderedPageBreak/>
         <w:t xml:space="preserve">      fixed book button on main page not doing anything</w:t>
       </w:r>
     </w:p>
@@ -2813,7 +2855,6 @@
           <w:sz w:val="16"/>
           <w:szCs w:val="16"/>
         </w:rPr>
-        <w:lastRenderedPageBreak/>
         <w:t xml:space="preserve">      Event editing functionality implemented</w:t>
       </w:r>
     </w:p>
@@ -4062,6 +4103,7 @@
           <w:sz w:val="16"/>
           <w:szCs w:val="16"/>
         </w:rPr>
+        <w:lastRenderedPageBreak/>
         <w:t xml:space="preserve">      fixed the image viewing in content cards</w:t>
       </w:r>
     </w:p>
@@ -4206,7 +4248,6 @@
         <w:rPr>
           <w:lang w:val="en-US"/>
         </w:rPr>
-        <w:lastRenderedPageBreak/>
         <w:br/>
         <w:t xml:space="preserve">I Tiernan Martin confirm that to my knowledge no AI was used in this assignment. </w:t>
       </w:r>
@@ -4459,7 +4500,69 @@
               <w:rPr>
                 <w:color w:val="0070C0"/>
               </w:rPr>
-              <w:t>Joshua Filled out, updated shortlog</w:t>
+              <w:t xml:space="preserve">Joshua Filled out, updated </w:t>
+            </w:r>
+            <w:r>
+              <w:rPr>
+                <w:color w:val="0070C0"/>
+              </w:rPr>
+              <w:t>short log</w:t>
+            </w:r>
+          </w:p>
+        </w:tc>
+      </w:tr>
+      <w:tr>
+        <w:tc>
+          <w:tcPr>
+            <w:tcW w:w="1149" w:type="dxa"/>
+          </w:tcPr>
+          <w:p>
+            <w:pPr>
+              <w:rPr>
+                <w:color w:val="0070C0"/>
+              </w:rPr>
+            </w:pPr>
+            <w:r>
+              <w:rPr>
+                <w:color w:val="0070C0"/>
+              </w:rPr>
+              <w:t>01/11/25</w:t>
+            </w:r>
+          </w:p>
+        </w:tc>
+        <w:tc>
+          <w:tcPr>
+            <w:tcW w:w="973" w:type="dxa"/>
+          </w:tcPr>
+          <w:p>
+            <w:pPr>
+              <w:rPr>
+                <w:color w:val="0070C0"/>
+              </w:rPr>
+            </w:pPr>
+            <w:r>
+              <w:rPr>
+                <w:color w:val="0070C0"/>
+              </w:rPr>
+              <w:t>V1.2</w:t>
+            </w:r>
+          </w:p>
+        </w:tc>
+        <w:tc>
+          <w:tcPr>
+            <w:tcW w:w="6894" w:type="dxa"/>
+          </w:tcPr>
+          <w:p>
+            <w:pPr>
+              <w:rPr>
+                <w:color w:val="0070C0"/>
+              </w:rPr>
+            </w:pPr>
+            <w:r>
+              <w:rPr>
+                <w:color w:val="0070C0"/>
+              </w:rPr>
+              <w:t>Nodir Filled out, updated short log</w:t>
             </w:r>
           </w:p>
         </w:tc>
@@ -5822,7 +5925,6 @@
   <w:style w:type="character" w:default="1" w:styleId="DefaultParagraphFont">
     <w:name w:val="Default Paragraph Font"/>
     <w:uiPriority w:val="1"/>
-    <w:semiHidden/>
     <w:unhideWhenUsed/>
   </w:style>
   <w:style w:type="table" w:default="1" w:styleId="TableNormal">

</xml_diff>